<commit_message>
Update docs and diagram
</commit_message>
<xml_diff>
--- a/domain.docx
+++ b/domain.docx
@@ -39,25 +39,143 @@
           <w:szCs w:val="24"/>
           <w:rtl w:val="0"/>
         </w:rPr>
-        <w:t xml:space="preserve">The database will be about home-building companies regarding materials needed to build homes.</w:t>
-      </w:r>
-    </w:p>
-    <w:p>
-      <w:pPr>
-        <w:rPr>
-          <w:rFonts w:ascii="Calibri" w:cs="Calibri" w:eastAsia="Calibri" w:hAnsi="Calibri"/>
-          <w:sz w:val="24"/>
-          <w:szCs w:val="24"/>
-        </w:rPr>
-      </w:pPr>
-      <w:r>
-        <w:rPr>
-          <w:rFonts w:ascii="Calibri" w:cs="Calibri" w:eastAsia="Calibri" w:hAnsi="Calibri"/>
-          <w:sz w:val="24"/>
-          <w:szCs w:val="24"/>
-          <w:rtl w:val="0"/>
-        </w:rPr>
-        <w:t xml:space="preserve">Requirements:</w:t>
+        <w:t xml:space="preserve">This database system will keep track of orders for materials needed for the construction of  buildings and the schedule that belongs to that construction. </w:t>
+      </w:r>
+      <w:r>
+        <w:rPr>
+          <w:rFonts w:ascii="Calibri" w:cs="Calibri" w:eastAsia="Calibri" w:hAnsi="Calibri"/>
+          <w:b w:val="0"/>
+          <w:bCs w:val="0"/>
+          <w:i w:val="0"/>
+          <w:iCs w:val="0"/>
+          <w:smallCaps w:val="0"/>
+          <w:strike w:val="0"/>
+          <w:color w:val="000000"/>
+          <w:sz w:val="24"/>
+          <w:szCs w:val="24"/>
+          <w:u w:val="none"/>
+          <w:shd w:fill="auto" w:val="clear"/>
+          <w:vertAlign w:val="baseline"/>
+          <w:rtl w:val="0"/>
+        </w:rPr>
+        <w:t xml:space="preserve">Home-building companie</w:t>
+      </w:r>
+      <w:r>
+        <w:rPr>
+          <w:rFonts w:ascii="Calibri" w:cs="Calibri" w:eastAsia="Calibri" w:hAnsi="Calibri"/>
+          <w:sz w:val="24"/>
+          <w:szCs w:val="24"/>
+          <w:rtl w:val="0"/>
+        </w:rPr>
+        <w:t xml:space="preserve">s have various employees like drivers, construction workers and office workers. Such companies also have to buy various materials from manufacturers. Such companies also have vehicles needed for building homes. Scheduling is also important, where it is important which office chair office workers get, which vehicle drivers get, and where the construction workers should be at what location to do their jobs.</w:t>
+      </w:r>
+    </w:p>
+    <w:p>
+      <w:pPr>
+        <w:rPr>
+          <w:rFonts w:ascii="Calibri" w:cs="Calibri" w:eastAsia="Calibri" w:hAnsi="Calibri"/>
+          <w:sz w:val="24"/>
+          <w:szCs w:val="24"/>
+        </w:rPr>
+      </w:pPr>
+      <w:r>
+        <w:rPr>
+          <w:rFonts w:ascii="Calibri" w:cs="Calibri" w:eastAsia="Calibri" w:hAnsi="Calibri"/>
+          <w:sz w:val="24"/>
+          <w:szCs w:val="24"/>
+          <w:rtl w:val="0"/>
+        </w:rPr>
+        <w:t xml:space="preserve">Home building companies have employees: drivers, office workers, and construction workers have an ID alongside with employee IDs. The IDs match the employee IDs, but the reason why there are additional IDs is to make identifying each specific employee easier when some employees have different responsibilities (driving, building, working in office). The managers do not have to know about other employees when for example managing a construction, so having additional IDs makes it easier for managers to look up employees and assign tasks according to it.</w:t>
+      </w:r>
+    </w:p>
+    <w:p>
+      <w:pPr>
+        <w:rPr>
+          <w:rFonts w:ascii="Calibri" w:cs="Calibri" w:eastAsia="Calibri" w:hAnsi="Calibri"/>
+          <w:sz w:val="24"/>
+          <w:szCs w:val="24"/>
+        </w:rPr>
+      </w:pPr>
+      <w:r>
+        <w:rPr>
+          <w:rFonts w:ascii="Calibri" w:cs="Calibri" w:eastAsia="Calibri" w:hAnsi="Calibri"/>
+          <w:sz w:val="24"/>
+          <w:szCs w:val="24"/>
+          <w:rtl w:val="0"/>
+        </w:rPr>
+        <w:t xml:space="preserve">A driver has a vehicle that he uses for various construction locations. The vehicles are scheduled according to in which construction place they should be used right now.</w:t>
+      </w:r>
+    </w:p>
+    <w:p>
+      <w:pPr>
+        <w:rPr>
+          <w:rFonts w:ascii="Calibri" w:cs="Calibri" w:eastAsia="Calibri" w:hAnsi="Calibri"/>
+          <w:sz w:val="24"/>
+          <w:szCs w:val="24"/>
+        </w:rPr>
+      </w:pPr>
+      <w:r>
+        <w:rPr>
+          <w:rFonts w:ascii="Calibri" w:cs="Calibri" w:eastAsia="Calibri" w:hAnsi="Calibri"/>
+          <w:sz w:val="24"/>
+          <w:szCs w:val="24"/>
+          <w:rtl w:val="0"/>
+        </w:rPr>
+        <w:t xml:space="preserve">A construction worker has tools (hammer, screwdriver) that he can use to build homes. It is important that construction schedule also accounts vehicle schedule in which vehicles are present at what locations.</w:t>
+      </w:r>
+    </w:p>
+    <w:p>
+      <w:pPr>
+        <w:rPr>
+          <w:rFonts w:ascii="Calibri" w:cs="Calibri" w:eastAsia="Calibri" w:hAnsi="Calibri"/>
+          <w:sz w:val="24"/>
+          <w:szCs w:val="24"/>
+        </w:rPr>
+      </w:pPr>
+      <w:r>
+        <w:rPr>
+          <w:rFonts w:ascii="Calibri" w:cs="Calibri" w:eastAsia="Calibri" w:hAnsi="Calibri"/>
+          <w:sz w:val="24"/>
+          <w:szCs w:val="24"/>
+          <w:rtl w:val="0"/>
+        </w:rPr>
+        <w:t xml:space="preserve">An office worker has a specific location where he sits to work (chair). Each office worker can remain in the same location for a long time or switch between chairs. Some office workers can also order materials from various manufacturers, and it is important that office workers know the schedule of construction beforehand to order materials appropriately.</w:t>
+      </w:r>
+    </w:p>
+    <w:p>
+      <w:pPr>
+        <w:rPr>
+          <w:rFonts w:ascii="Calibri" w:cs="Calibri" w:eastAsia="Calibri" w:hAnsi="Calibri"/>
+          <w:sz w:val="24"/>
+          <w:szCs w:val="24"/>
+        </w:rPr>
+      </w:pPr>
+      <w:r>
+        <w:rPr>
+          <w:rFonts w:ascii="Calibri" w:cs="Calibri" w:eastAsia="Calibri" w:hAnsi="Calibri"/>
+          <w:sz w:val="24"/>
+          <w:szCs w:val="24"/>
+          <w:rtl w:val="0"/>
+        </w:rPr>
+        <w:t xml:space="preserve">The requirements are that each entity in a table gets a unique ID. Some entities are also related to each other, like materials with manufacturers, schedules with employees and chair/vehicle/location.</w:t>
+      </w:r>
+    </w:p>
+    <w:p>
+      <w:pPr>
+        <w:rPr>
+          <w:rFonts w:ascii="Calibri" w:cs="Calibri" w:eastAsia="Calibri" w:hAnsi="Calibri"/>
+          <w:sz w:val="24"/>
+          <w:szCs w:val="24"/>
+        </w:rPr>
+      </w:pPr>
+      <w:r>
+        <w:rPr>
+          <w:rFonts w:ascii="Calibri" w:cs="Calibri" w:eastAsia="Calibri" w:hAnsi="Calibri"/>
+          <w:sz w:val="24"/>
+          <w:szCs w:val="24"/>
+          <w:rtl w:val="0"/>
+        </w:rPr>
+        <w:t xml:space="preserve">The constraints are that home-building companies only focus on building livable spaces for people like apartments, villas, and so on. They do not build offices, schools, and other non-livable spaces. They also have limited availability of materials, vehicles, and employees, so the companies must make sure they allocate each resource efficiently.</w:t>
       </w:r>
     </w:p>
     <w:p>
@@ -83,47 +201,19 @@
         <w:jc w:val="left"/>
         <w:rPr>
           <w:rFonts w:ascii="Calibri" w:cs="Calibri" w:eastAsia="Calibri" w:hAnsi="Calibri"/>
-          <w:b w:val="0"/>
-          <w:bCs w:val="0"/>
-          <w:i w:val="0"/>
-          <w:iCs w:val="0"/>
-          <w:smallCaps w:val="0"/>
-          <w:strike w:val="0"/>
-          <w:color w:val="000000"/>
           <w:sz w:val="24"/>
           <w:szCs w:val="24"/>
           <w:u w:val="none"/>
-          <w:shd w:fill="auto" w:val="clear"/>
-          <w:vertAlign w:val="baseline"/>
-        </w:rPr>
-      </w:pPr>
-      <w:r>
-        <w:rPr>
-          <w:rFonts w:ascii="Calibri" w:cs="Calibri" w:eastAsia="Calibri" w:hAnsi="Calibri"/>
-          <w:b w:val="0"/>
-          <w:bCs w:val="0"/>
-          <w:i w:val="0"/>
-          <w:iCs w:val="0"/>
-          <w:smallCaps w:val="0"/>
-          <w:strike w:val="0"/>
-          <w:color w:val="000000"/>
-          <w:sz w:val="24"/>
-          <w:szCs w:val="24"/>
-          <w:u w:val="none"/>
-          <w:shd w:fill="auto" w:val="clear"/>
-          <w:vertAlign w:val="baseline"/>
-          <w:rtl w:val="0"/>
-        </w:rPr>
-        <w:t xml:space="preserve">Home-building companies</w:t>
-      </w:r>
-      <w:r>
-        <w:rPr>
-          <w:rFonts w:ascii="Calibri" w:cs="Calibri" w:eastAsia="Calibri" w:hAnsi="Calibri"/>
-          <w:sz w:val="24"/>
-          <w:szCs w:val="24"/>
-          <w:rtl w:val="0"/>
-        </w:rPr>
-        <w:t xml:space="preserve">…</w:t>
+        </w:rPr>
+      </w:pPr>
+      <w:r>
+        <w:rPr>
+          <w:rFonts w:ascii="Calibri" w:cs="Calibri" w:eastAsia="Calibri" w:hAnsi="Calibri"/>
+          <w:sz w:val="24"/>
+          <w:szCs w:val="24"/>
+          <w:rtl w:val="0"/>
+        </w:rPr>
+        <w:t xml:space="preserve">// what needs to be modeled, don’t go overboard with description</w:t>
       </w:r>
     </w:p>
     <w:p>
@@ -161,7 +251,7 @@
           <w:szCs w:val="24"/>
           <w:rtl w:val="0"/>
         </w:rPr>
-        <w:t xml:space="preserve">// what needs to be modeled and why, don’t go overboard with description</w:t>
+        <w:t xml:space="preserve">// state what are important entities and how do they relate</w:t>
       </w:r>
     </w:p>
     <w:p>
@@ -199,7 +289,157 @@
           <w:szCs w:val="24"/>
           <w:rtl w:val="0"/>
         </w:rPr>
-        <w:t xml:space="preserve">// state what are important entities and how do they relate</w:t>
+        <w:t xml:space="preserve">// specific constraints</w:t>
+      </w:r>
+    </w:p>
+    <w:p>
+      <w:pPr>
+        <w:rPr>
+          <w:rFonts w:ascii="Calibri" w:cs="Calibri" w:eastAsia="Calibri" w:hAnsi="Calibri"/>
+          <w:sz w:val="24"/>
+          <w:szCs w:val="24"/>
+        </w:rPr>
+      </w:pPr>
+      <w:r>
+        <w:rPr>
+          <w:rtl w:val="0"/>
+        </w:rPr>
+      </w:r>
+    </w:p>
+    <w:p>
+      <w:pPr>
+        <w:rPr>
+          <w:rFonts w:ascii="Calibri" w:cs="Calibri" w:eastAsia="Calibri" w:hAnsi="Calibri"/>
+          <w:b w:val="1"/>
+          <w:bCs w:val="1"/>
+          <w:sz w:val="40"/>
+          <w:szCs w:val="40"/>
+        </w:rPr>
+      </w:pPr>
+      <w:r>
+        <w:rPr>
+          <w:rFonts w:ascii="Calibri" w:cs="Calibri" w:eastAsia="Calibri" w:hAnsi="Calibri"/>
+          <w:b w:val="1"/>
+          <w:bCs w:val="1"/>
+          <w:sz w:val="40"/>
+          <w:szCs w:val="40"/>
+          <w:rtl w:val="0"/>
+        </w:rPr>
+        <w:t xml:space="preserve">ER.docx</w:t>
+      </w:r>
+    </w:p>
+    <w:p>
+      <w:pPr>
+        <w:rPr>
+          <w:rFonts w:ascii="Calibri" w:cs="Calibri" w:eastAsia="Calibri" w:hAnsi="Calibri"/>
+          <w:sz w:val="24"/>
+          <w:szCs w:val="24"/>
+        </w:rPr>
+      </w:pPr>
+      <w:r>
+        <w:rPr>
+          <w:rFonts w:ascii="Calibri" w:cs="Calibri" w:eastAsia="Calibri" w:hAnsi="Calibri"/>
+          <w:sz w:val="24"/>
+          <w:szCs w:val="24"/>
+          <w:rtl w:val="0"/>
+        </w:rPr>
+        <w:t xml:space="preserve">All attributes are required to be valid data unless marked with “(optional)”.</w:t>
+      </w:r>
+    </w:p>
+    <w:p>
+      <w:pPr>
+        <w:rPr>
+          <w:rFonts w:ascii="Calibri" w:cs="Calibri" w:eastAsia="Calibri" w:hAnsi="Calibri"/>
+          <w:sz w:val="24"/>
+          <w:szCs w:val="24"/>
+        </w:rPr>
+      </w:pPr>
+      <w:r>
+        <w:rPr>
+          <w:rFonts w:ascii="Calibri" w:cs="Calibri" w:eastAsia="Calibri" w:hAnsi="Calibri"/>
+          <w:sz w:val="24"/>
+          <w:szCs w:val="24"/>
+          <w:rtl w:val="0"/>
+        </w:rPr>
+        <w:t xml:space="preserve">// note: ask this question to determine 1:1, 1:n, n:m, can 1 single attribute appear multiple times in other table instances, or is it exactly 1 attribute only for 1 specific table instance? Note that table here refers to an instance of the entity, like constructing multiple objects of 1 class.</w:t>
+      </w:r>
+    </w:p>
+    <w:p>
+      <w:pPr>
+        <w:rPr>
+          <w:rFonts w:ascii="Calibri" w:cs="Calibri" w:eastAsia="Calibri" w:hAnsi="Calibri"/>
+          <w:sz w:val="24"/>
+          <w:szCs w:val="24"/>
+        </w:rPr>
+      </w:pPr>
+      <w:r>
+        <w:rPr>
+          <w:rtl w:val="0"/>
+        </w:rPr>
+      </w:r>
+    </w:p>
+    <w:p>
+      <w:pPr>
+        <w:rPr>
+          <w:rFonts w:ascii="Calibri" w:cs="Calibri" w:eastAsia="Calibri" w:hAnsi="Calibri"/>
+          <w:sz w:val="24"/>
+          <w:szCs w:val="24"/>
+        </w:rPr>
+      </w:pPr>
+      <w:r>
+        <w:rPr>
+          <w:rFonts w:ascii="Calibri" w:cs="Calibri" w:eastAsia="Calibri" w:hAnsi="Calibri"/>
+          <w:sz w:val="24"/>
+          <w:szCs w:val="24"/>
+          <w:rtl w:val="0"/>
+        </w:rPr>
+        <w:t xml:space="preserve">Entity Order:</w:t>
+      </w:r>
+    </w:p>
+    <w:p>
+      <w:pPr>
+        <w:numPr>
+          <w:ilvl w:val="0"/>
+          <w:numId w:val="12"/>
+        </w:numPr>
+        <w:spacing w:after="0" w:afterAutospacing="0"/>
+        <w:ind w:left="720" w:hanging="360"/>
+        <w:rPr>
+          <w:rFonts w:ascii="Calibri" w:cs="Calibri" w:eastAsia="Calibri" w:hAnsi="Calibri"/>
+          <w:sz w:val="24"/>
+          <w:szCs w:val="24"/>
+          <w:u w:val="none"/>
+        </w:rPr>
+      </w:pPr>
+      <w:r>
+        <w:rPr>
+          <w:rFonts w:ascii="Calibri" w:cs="Calibri" w:eastAsia="Calibri" w:hAnsi="Calibri"/>
+          <w:sz w:val="24"/>
+          <w:szCs w:val="24"/>
+          <w:rtl w:val="0"/>
+        </w:rPr>
+        <w:t xml:space="preserve">Order relates SingleMaterialProduct (1:n)</w:t>
+      </w:r>
+    </w:p>
+    <w:p>
+      <w:pPr>
+        <w:numPr>
+          <w:ilvl w:val="0"/>
+          <w:numId w:val="12"/>
+        </w:numPr>
+        <w:spacing w:after="0" w:afterAutospacing="0"/>
+        <w:ind w:left="720" w:hanging="360"/>
+        <w:rPr>
+          <w:rFonts w:ascii="Calibri" w:cs="Calibri" w:eastAsia="Calibri" w:hAnsi="Calibri"/>
+          <w:sz w:val="24"/>
+          <w:szCs w:val="24"/>
+          <w:u w:val="none"/>
+        </w:rPr>
+      </w:pPr>
+      <w:r>
+        <w:rPr>
+          <w:rtl w:val="0"/>
+        </w:rPr>
       </w:r>
     </w:p>
     <w:p>
@@ -210,7 +450,219 @@
         <w:widowControl w:val="1"/>
         <w:numPr>
           <w:ilvl w:val="0"/>
-          <w:numId w:val="9"/>
+          <w:numId w:val="8"/>
+        </w:numPr>
+        <w:pBdr>
+          <w:top w:space="0" w:sz="0" w:val="nil"/>
+          <w:left w:space="0" w:sz="0" w:val="nil"/>
+          <w:bottom w:space="0" w:sz="0" w:val="nil"/>
+          <w:right w:space="0" w:sz="0" w:val="nil"/>
+          <w:between w:space="0" w:sz="0" w:val="nil"/>
+        </w:pBdr>
+        <w:shd w:fill="auto" w:val="clear"/>
+        <w:spacing w:after="0" w:before="0" w:line="259" w:lineRule="auto"/>
+        <w:ind w:left="720" w:right="0" w:hanging="360"/>
+        <w:jc w:val="left"/>
+        <w:rPr>
+          <w:rFonts w:ascii="Calibri" w:cs="Calibri" w:eastAsia="Calibri" w:hAnsi="Calibri"/>
+          <w:b w:val="0"/>
+          <w:bCs w:val="0"/>
+          <w:i w:val="0"/>
+          <w:iCs w:val="0"/>
+          <w:smallCaps w:val="0"/>
+          <w:strike w:val="0"/>
+          <w:color w:val="000000"/>
+          <w:sz w:val="24"/>
+          <w:szCs w:val="24"/>
+          <w:u w:val="none"/>
+          <w:shd w:fill="auto" w:val="clear"/>
+          <w:vertAlign w:val="baseline"/>
+        </w:rPr>
+      </w:pPr>
+      <w:r>
+        <w:rPr>
+          <w:rFonts w:ascii="Calibri" w:cs="Calibri" w:eastAsia="Calibri" w:hAnsi="Calibri"/>
+          <w:sz w:val="24"/>
+          <w:szCs w:val="24"/>
+          <w:rtl w:val="0"/>
+        </w:rPr>
+        <w:t xml:space="preserve">Order ID (primary key)</w:t>
+      </w:r>
+    </w:p>
+    <w:p>
+      <w:pPr>
+        <w:keepNext w:val="0"/>
+        <w:keepLines w:val="0"/>
+        <w:pageBreakBefore w:val="0"/>
+        <w:widowControl w:val="1"/>
+        <w:numPr>
+          <w:ilvl w:val="0"/>
+          <w:numId w:val="8"/>
+        </w:numPr>
+        <w:pBdr>
+          <w:top w:space="0" w:sz="0" w:val="nil"/>
+          <w:left w:space="0" w:sz="0" w:val="nil"/>
+          <w:bottom w:space="0" w:sz="0" w:val="nil"/>
+          <w:right w:space="0" w:sz="0" w:val="nil"/>
+          <w:between w:space="0" w:sz="0" w:val="nil"/>
+        </w:pBdr>
+        <w:shd w:fill="auto" w:val="clear"/>
+        <w:spacing w:after="0" w:before="0" w:line="259" w:lineRule="auto"/>
+        <w:ind w:left="720" w:right="0" w:hanging="360"/>
+        <w:jc w:val="left"/>
+        <w:rPr>
+          <w:rFonts w:ascii="Calibri" w:cs="Calibri" w:eastAsia="Calibri" w:hAnsi="Calibri"/>
+          <w:b w:val="0"/>
+          <w:bCs w:val="0"/>
+          <w:i w:val="0"/>
+          <w:iCs w:val="0"/>
+          <w:smallCaps w:val="0"/>
+          <w:strike w:val="0"/>
+          <w:color w:val="000000"/>
+          <w:sz w:val="24"/>
+          <w:szCs w:val="24"/>
+          <w:u w:val="none"/>
+          <w:shd w:fill="auto" w:val="clear"/>
+          <w:vertAlign w:val="baseline"/>
+        </w:rPr>
+      </w:pPr>
+      <w:r>
+        <w:rPr>
+          <w:rFonts w:ascii="Calibri" w:cs="Calibri" w:eastAsia="Calibri" w:hAnsi="Calibri"/>
+          <w:sz w:val="24"/>
+          <w:szCs w:val="24"/>
+          <w:rtl w:val="0"/>
+        </w:rPr>
+        <w:t xml:space="preserve">Single material product ID</w:t>
+      </w:r>
+      <w:r>
+        <w:rPr>
+          <w:rFonts w:ascii="Calibri" w:cs="Calibri" w:eastAsia="Calibri" w:hAnsi="Calibri"/>
+          <w:b w:val="0"/>
+          <w:bCs w:val="0"/>
+          <w:i w:val="0"/>
+          <w:iCs w:val="0"/>
+          <w:smallCaps w:val="0"/>
+          <w:strike w:val="0"/>
+          <w:color w:val="000000"/>
+          <w:sz w:val="24"/>
+          <w:szCs w:val="24"/>
+          <w:u w:val="none"/>
+          <w:shd w:fill="auto" w:val="clear"/>
+          <w:vertAlign w:val="baseline"/>
+          <w:rtl w:val="0"/>
+        </w:rPr>
+        <w:t xml:space="preserve"> (foreign key references entity </w:t>
+      </w:r>
+      <w:r>
+        <w:rPr>
+          <w:rFonts w:ascii="Calibri" w:cs="Calibri" w:eastAsia="Calibri" w:hAnsi="Calibri"/>
+          <w:sz w:val="24"/>
+          <w:szCs w:val="24"/>
+          <w:rtl w:val="0"/>
+        </w:rPr>
+        <w:t xml:space="preserve">SingleMaterialProduct</w:t>
+      </w:r>
+      <w:r>
+        <w:rPr>
+          <w:rFonts w:ascii="Calibri" w:cs="Calibri" w:eastAsia="Calibri" w:hAnsi="Calibri"/>
+          <w:b w:val="0"/>
+          <w:bCs w:val="0"/>
+          <w:i w:val="0"/>
+          <w:iCs w:val="0"/>
+          <w:smallCaps w:val="0"/>
+          <w:strike w:val="0"/>
+          <w:color w:val="000000"/>
+          <w:sz w:val="24"/>
+          <w:szCs w:val="24"/>
+          <w:u w:val="none"/>
+          <w:shd w:fill="auto" w:val="clear"/>
+          <w:vertAlign w:val="baseline"/>
+          <w:rtl w:val="0"/>
+        </w:rPr>
+        <w:t xml:space="preserve">)</w:t>
+      </w:r>
+    </w:p>
+    <w:p>
+      <w:pPr>
+        <w:keepNext w:val="0"/>
+        <w:keepLines w:val="0"/>
+        <w:pageBreakBefore w:val="0"/>
+        <w:widowControl w:val="1"/>
+        <w:numPr>
+          <w:ilvl w:val="0"/>
+          <w:numId w:val="8"/>
+        </w:numPr>
+        <w:pBdr>
+          <w:top w:space="0" w:sz="0" w:val="nil"/>
+          <w:left w:space="0" w:sz="0" w:val="nil"/>
+          <w:bottom w:space="0" w:sz="0" w:val="nil"/>
+          <w:right w:space="0" w:sz="0" w:val="nil"/>
+          <w:between w:space="0" w:sz="0" w:val="nil"/>
+        </w:pBdr>
+        <w:shd w:fill="auto" w:val="clear"/>
+        <w:spacing w:after="0" w:before="0" w:line="259" w:lineRule="auto"/>
+        <w:ind w:left="720" w:right="0" w:hanging="360"/>
+        <w:jc w:val="left"/>
+        <w:rPr>
+          <w:rFonts w:ascii="Calibri" w:cs="Calibri" w:eastAsia="Calibri" w:hAnsi="Calibri"/>
+          <w:b w:val="0"/>
+          <w:bCs w:val="0"/>
+          <w:i w:val="0"/>
+          <w:iCs w:val="0"/>
+          <w:smallCaps w:val="0"/>
+          <w:strike w:val="0"/>
+          <w:color w:val="000000"/>
+          <w:sz w:val="24"/>
+          <w:szCs w:val="24"/>
+          <w:u w:val="none"/>
+          <w:shd w:fill="auto" w:val="clear"/>
+          <w:vertAlign w:val="baseline"/>
+        </w:rPr>
+      </w:pPr>
+      <w:r>
+        <w:rPr>
+          <w:rFonts w:ascii="Calibri" w:cs="Calibri" w:eastAsia="Calibri" w:hAnsi="Calibri"/>
+          <w:b w:val="0"/>
+          <w:bCs w:val="0"/>
+          <w:i w:val="0"/>
+          <w:iCs w:val="0"/>
+          <w:smallCaps w:val="0"/>
+          <w:strike w:val="0"/>
+          <w:color w:val="000000"/>
+          <w:sz w:val="24"/>
+          <w:szCs w:val="24"/>
+          <w:u w:val="none"/>
+          <w:shd w:fill="auto" w:val="clear"/>
+          <w:vertAlign w:val="baseline"/>
+          <w:rtl w:val="0"/>
+        </w:rPr>
+        <w:t xml:space="preserve">Date </w:t>
+      </w:r>
+      <w:r>
+        <w:rPr>
+          <w:rFonts w:ascii="Calibri" w:cs="Calibri" w:eastAsia="Calibri" w:hAnsi="Calibri"/>
+          <w:sz w:val="24"/>
+          <w:szCs w:val="24"/>
+          <w:rtl w:val="0"/>
+        </w:rPr>
+        <w:t xml:space="preserve">- text</w:t>
+      </w:r>
+      <w:r>
+        <w:rPr>
+          <w:rtl w:val="0"/>
+        </w:rPr>
+      </w:r>
+    </w:p>
+    <w:p>
+      <w:pPr>
+        <w:keepNext w:val="0"/>
+        <w:keepLines w:val="0"/>
+        <w:pageBreakBefore w:val="0"/>
+        <w:widowControl w:val="1"/>
+        <w:numPr>
+          <w:ilvl w:val="0"/>
+          <w:numId w:val="8"/>
         </w:numPr>
         <w:pBdr>
           <w:top w:space="0" w:sz="0" w:val="nil"/>
@@ -225,194 +677,6 @@
         <w:jc w:val="left"/>
         <w:rPr>
           <w:rFonts w:ascii="Calibri" w:cs="Calibri" w:eastAsia="Calibri" w:hAnsi="Calibri"/>
-          <w:sz w:val="24"/>
-          <w:szCs w:val="24"/>
-          <w:u w:val="none"/>
-        </w:rPr>
-      </w:pPr>
-      <w:r>
-        <w:rPr>
-          <w:rFonts w:ascii="Calibri" w:cs="Calibri" w:eastAsia="Calibri" w:hAnsi="Calibri"/>
-          <w:sz w:val="24"/>
-          <w:szCs w:val="24"/>
-          <w:rtl w:val="0"/>
-        </w:rPr>
-        <w:t xml:space="preserve">// specific constraints</w:t>
-      </w:r>
-    </w:p>
-    <w:p>
-      <w:pPr>
-        <w:rPr>
-          <w:rFonts w:ascii="Calibri" w:cs="Calibri" w:eastAsia="Calibri" w:hAnsi="Calibri"/>
-          <w:sz w:val="24"/>
-          <w:szCs w:val="24"/>
-        </w:rPr>
-      </w:pPr>
-      <w:r>
-        <w:rPr>
-          <w:rtl w:val="0"/>
-        </w:rPr>
-      </w:r>
-    </w:p>
-    <w:p>
-      <w:pPr>
-        <w:rPr>
-          <w:rFonts w:ascii="Calibri" w:cs="Calibri" w:eastAsia="Calibri" w:hAnsi="Calibri"/>
-          <w:b w:val="1"/>
-          <w:bCs w:val="1"/>
-          <w:sz w:val="40"/>
-          <w:szCs w:val="40"/>
-        </w:rPr>
-      </w:pPr>
-      <w:r>
-        <w:rPr>
-          <w:rFonts w:ascii="Calibri" w:cs="Calibri" w:eastAsia="Calibri" w:hAnsi="Calibri"/>
-          <w:b w:val="1"/>
-          <w:bCs w:val="1"/>
-          <w:sz w:val="40"/>
-          <w:szCs w:val="40"/>
-          <w:rtl w:val="0"/>
-        </w:rPr>
-        <w:t xml:space="preserve">ER.docx</w:t>
-      </w:r>
-    </w:p>
-    <w:p>
-      <w:pPr>
-        <w:rPr>
-          <w:rFonts w:ascii="Calibri" w:cs="Calibri" w:eastAsia="Calibri" w:hAnsi="Calibri"/>
-          <w:sz w:val="24"/>
-          <w:szCs w:val="24"/>
-        </w:rPr>
-      </w:pPr>
-      <w:r>
-        <w:rPr>
-          <w:rFonts w:ascii="Calibri" w:cs="Calibri" w:eastAsia="Calibri" w:hAnsi="Calibri"/>
-          <w:sz w:val="24"/>
-          <w:szCs w:val="24"/>
-          <w:rtl w:val="0"/>
-        </w:rPr>
-        <w:t xml:space="preserve">All attributes are required to be valid data unless marked with “(optional)”.</w:t>
-      </w:r>
-    </w:p>
-    <w:p>
-      <w:pPr>
-        <w:rPr>
-          <w:rFonts w:ascii="Calibri" w:cs="Calibri" w:eastAsia="Calibri" w:hAnsi="Calibri"/>
-          <w:sz w:val="24"/>
-          <w:szCs w:val="24"/>
-        </w:rPr>
-      </w:pPr>
-      <w:r>
-        <w:rPr>
-          <w:rFonts w:ascii="Calibri" w:cs="Calibri" w:eastAsia="Calibri" w:hAnsi="Calibri"/>
-          <w:sz w:val="24"/>
-          <w:szCs w:val="24"/>
-          <w:rtl w:val="0"/>
-        </w:rPr>
-        <w:t xml:space="preserve">// note: ask this question to determine 1:1, 1:n, n:m, can 1 single attribute appear multiple times in other table instances, or is it exactly 1 attribute only for 1 specific table instance? Note that table here refers to an instance of the entity, like constructing multiple objects of 1 class.</w:t>
-      </w:r>
-    </w:p>
-    <w:p>
-      <w:pPr>
-        <w:rPr>
-          <w:rFonts w:ascii="Calibri" w:cs="Calibri" w:eastAsia="Calibri" w:hAnsi="Calibri"/>
-          <w:sz w:val="24"/>
-          <w:szCs w:val="24"/>
-        </w:rPr>
-      </w:pPr>
-      <w:r>
-        <w:rPr>
-          <w:rtl w:val="0"/>
-        </w:rPr>
-      </w:r>
-    </w:p>
-    <w:p>
-      <w:pPr>
-        <w:rPr>
-          <w:rFonts w:ascii="Calibri" w:cs="Calibri" w:eastAsia="Calibri" w:hAnsi="Calibri"/>
-          <w:sz w:val="24"/>
-          <w:szCs w:val="24"/>
-        </w:rPr>
-      </w:pPr>
-      <w:r>
-        <w:rPr>
-          <w:rFonts w:ascii="Calibri" w:cs="Calibri" w:eastAsia="Calibri" w:hAnsi="Calibri"/>
-          <w:sz w:val="24"/>
-          <w:szCs w:val="24"/>
-          <w:rtl w:val="0"/>
-        </w:rPr>
-        <w:t xml:space="preserve">Entity Order:</w:t>
-      </w:r>
-    </w:p>
-    <w:p>
-      <w:pPr>
-        <w:numPr>
-          <w:ilvl w:val="0"/>
-          <w:numId w:val="12"/>
-        </w:numPr>
-        <w:spacing w:after="0" w:afterAutospacing="0"/>
-        <w:ind w:left="720" w:hanging="360"/>
-        <w:rPr>
-          <w:rFonts w:ascii="Calibri" w:cs="Calibri" w:eastAsia="Calibri" w:hAnsi="Calibri"/>
-          <w:sz w:val="24"/>
-          <w:szCs w:val="24"/>
-          <w:u w:val="none"/>
-        </w:rPr>
-      </w:pPr>
-      <w:r>
-        <w:rPr>
-          <w:rFonts w:ascii="Calibri" w:cs="Calibri" w:eastAsia="Calibri" w:hAnsi="Calibri"/>
-          <w:sz w:val="24"/>
-          <w:szCs w:val="24"/>
-          <w:rtl w:val="0"/>
-        </w:rPr>
-        <w:t xml:space="preserve">Order relates SingleMaterialProduct (1:n)</w:t>
-      </w:r>
-    </w:p>
-    <w:p>
-      <w:pPr>
-        <w:numPr>
-          <w:ilvl w:val="0"/>
-          <w:numId w:val="12"/>
-        </w:numPr>
-        <w:spacing w:after="0" w:afterAutospacing="0"/>
-        <w:ind w:left="720" w:hanging="360"/>
-        <w:rPr>
-          <w:rFonts w:ascii="Calibri" w:cs="Calibri" w:eastAsia="Calibri" w:hAnsi="Calibri"/>
-          <w:sz w:val="24"/>
-          <w:szCs w:val="24"/>
-          <w:u w:val="none"/>
-        </w:rPr>
-      </w:pPr>
-      <w:r>
-        <w:rPr>
-          <w:rtl w:val="0"/>
-        </w:rPr>
-      </w:r>
-    </w:p>
-    <w:p>
-      <w:pPr>
-        <w:keepNext w:val="0"/>
-        <w:keepLines w:val="0"/>
-        <w:pageBreakBefore w:val="0"/>
-        <w:widowControl w:val="1"/>
-        <w:numPr>
-          <w:ilvl w:val="0"/>
-          <w:numId w:val="8"/>
-        </w:numPr>
-        <w:pBdr>
-          <w:top w:space="0" w:sz="0" w:val="nil"/>
-          <w:left w:space="0" w:sz="0" w:val="nil"/>
-          <w:bottom w:space="0" w:sz="0" w:val="nil"/>
-          <w:right w:space="0" w:sz="0" w:val="nil"/>
-          <w:between w:space="0" w:sz="0" w:val="nil"/>
-        </w:pBdr>
-        <w:shd w:fill="auto" w:val="clear"/>
-        <w:spacing w:after="0" w:before="0" w:line="259" w:lineRule="auto"/>
-        <w:ind w:left="720" w:right="0" w:hanging="360"/>
-        <w:jc w:val="left"/>
-        <w:rPr>
-          <w:rFonts w:ascii="Calibri" w:cs="Calibri" w:eastAsia="Calibri" w:hAnsi="Calibri"/>
           <w:b w:val="0"/>
           <w:bCs w:val="0"/>
           <w:i w:val="0"/>
@@ -430,36 +694,6 @@
       <w:r>
         <w:rPr>
           <w:rFonts w:ascii="Calibri" w:cs="Calibri" w:eastAsia="Calibri" w:hAnsi="Calibri"/>
-          <w:sz w:val="24"/>
-          <w:szCs w:val="24"/>
-          <w:rtl w:val="0"/>
-        </w:rPr>
-        <w:t xml:space="preserve">Order ID (primary key)</w:t>
-      </w:r>
-    </w:p>
-    <w:p>
-      <w:pPr>
-        <w:keepNext w:val="0"/>
-        <w:keepLines w:val="0"/>
-        <w:pageBreakBefore w:val="0"/>
-        <w:widowControl w:val="1"/>
-        <w:numPr>
-          <w:ilvl w:val="0"/>
-          <w:numId w:val="8"/>
-        </w:numPr>
-        <w:pBdr>
-          <w:top w:space="0" w:sz="0" w:val="nil"/>
-          <w:left w:space="0" w:sz="0" w:val="nil"/>
-          <w:bottom w:space="0" w:sz="0" w:val="nil"/>
-          <w:right w:space="0" w:sz="0" w:val="nil"/>
-          <w:between w:space="0" w:sz="0" w:val="nil"/>
-        </w:pBdr>
-        <w:shd w:fill="auto" w:val="clear"/>
-        <w:spacing w:after="0" w:before="0" w:line="259" w:lineRule="auto"/>
-        <w:ind w:left="720" w:right="0" w:hanging="360"/>
-        <w:jc w:val="left"/>
-        <w:rPr>
-          <w:rFonts w:ascii="Calibri" w:cs="Calibri" w:eastAsia="Calibri" w:hAnsi="Calibri"/>
           <w:b w:val="0"/>
           <w:bCs w:val="0"/>
           <w:i w:val="0"/>
@@ -472,230 +706,987 @@
           <w:u w:val="none"/>
           <w:shd w:fill="auto" w:val="clear"/>
           <w:vertAlign w:val="baseline"/>
-        </w:rPr>
-      </w:pPr>
-      <w:r>
-        <w:rPr>
-          <w:rFonts w:ascii="Calibri" w:cs="Calibri" w:eastAsia="Calibri" w:hAnsi="Calibri"/>
-          <w:sz w:val="24"/>
-          <w:szCs w:val="24"/>
-          <w:rtl w:val="0"/>
-        </w:rPr>
-        <w:t xml:space="preserve">Single material product ID</w:t>
-      </w:r>
-      <w:r>
-        <w:rPr>
-          <w:rFonts w:ascii="Calibri" w:cs="Calibri" w:eastAsia="Calibri" w:hAnsi="Calibri"/>
-          <w:b w:val="0"/>
-          <w:bCs w:val="0"/>
-          <w:i w:val="0"/>
-          <w:iCs w:val="0"/>
-          <w:smallCaps w:val="0"/>
-          <w:strike w:val="0"/>
-          <w:color w:val="000000"/>
+          <w:rtl w:val="0"/>
+        </w:rPr>
+        <w:t xml:space="preserve">Price </w:t>
+      </w:r>
+      <w:r>
+        <w:rPr>
+          <w:rFonts w:ascii="Calibri" w:cs="Calibri" w:eastAsia="Calibri" w:hAnsi="Calibri"/>
+          <w:sz w:val="24"/>
+          <w:szCs w:val="24"/>
+          <w:rtl w:val="0"/>
+        </w:rPr>
+        <w:t xml:space="preserve">- integer </w:t>
+      </w:r>
+      <w:r>
+        <w:rPr>
+          <w:rtl w:val="0"/>
+        </w:rPr>
+      </w:r>
+    </w:p>
+    <w:p>
+      <w:pPr>
+        <w:rPr>
+          <w:rFonts w:ascii="Calibri" w:cs="Calibri" w:eastAsia="Calibri" w:hAnsi="Calibri"/>
+          <w:sz w:val="24"/>
+          <w:szCs w:val="24"/>
+        </w:rPr>
+      </w:pPr>
+      <w:r>
+        <w:rPr>
+          <w:rFonts w:ascii="Calibri" w:cs="Calibri" w:eastAsia="Calibri" w:hAnsi="Calibri"/>
+          <w:sz w:val="24"/>
+          <w:szCs w:val="24"/>
+          <w:rtl w:val="0"/>
+        </w:rPr>
+        <w:t xml:space="preserve">Entity SingleMaterialProduct:</w:t>
+      </w:r>
+    </w:p>
+    <w:p>
+      <w:pPr>
+        <w:numPr>
+          <w:ilvl w:val="0"/>
+          <w:numId w:val="14"/>
+        </w:numPr>
+        <w:spacing w:after="0" w:afterAutospacing="0"/>
+        <w:ind w:left="720" w:hanging="360"/>
+        <w:rPr>
+          <w:rFonts w:ascii="Calibri" w:cs="Calibri" w:eastAsia="Calibri" w:hAnsi="Calibri"/>
+          <w:sz w:val="24"/>
+          <w:szCs w:val="24"/>
+        </w:rPr>
+      </w:pPr>
+      <w:r>
+        <w:rPr>
+          <w:rFonts w:ascii="Calibri" w:cs="Calibri" w:eastAsia="Calibri" w:hAnsi="Calibri"/>
+          <w:sz w:val="24"/>
+          <w:szCs w:val="24"/>
+          <w:rtl w:val="0"/>
+        </w:rPr>
+        <w:t xml:space="preserve">SingleMaterialProduct relates Manufacturer (m:1)</w:t>
+      </w:r>
+    </w:p>
+    <w:p>
+      <w:pPr>
+        <w:numPr>
+          <w:ilvl w:val="0"/>
+          <w:numId w:val="14"/>
+        </w:numPr>
+        <w:spacing w:after="0" w:afterAutospacing="0"/>
+        <w:ind w:left="720" w:hanging="360"/>
+        <w:rPr>
+          <w:rFonts w:ascii="Calibri" w:cs="Calibri" w:eastAsia="Calibri" w:hAnsi="Calibri"/>
           <w:sz w:val="24"/>
           <w:szCs w:val="24"/>
           <w:u w:val="none"/>
-          <w:shd w:fill="auto" w:val="clear"/>
-          <w:vertAlign w:val="baseline"/>
-          <w:rtl w:val="0"/>
-        </w:rPr>
-        <w:t xml:space="preserve"> (foreign key references entity </w:t>
-      </w:r>
-      <w:r>
-        <w:rPr>
-          <w:rFonts w:ascii="Calibri" w:cs="Calibri" w:eastAsia="Calibri" w:hAnsi="Calibri"/>
-          <w:sz w:val="24"/>
-          <w:szCs w:val="24"/>
-          <w:rtl w:val="0"/>
-        </w:rPr>
-        <w:t xml:space="preserve">SingleMaterialProduct</w:t>
-      </w:r>
-      <w:r>
-        <w:rPr>
-          <w:rFonts w:ascii="Calibri" w:cs="Calibri" w:eastAsia="Calibri" w:hAnsi="Calibri"/>
-          <w:b w:val="0"/>
-          <w:bCs w:val="0"/>
-          <w:i w:val="0"/>
-          <w:iCs w:val="0"/>
-          <w:smallCaps w:val="0"/>
-          <w:strike w:val="0"/>
-          <w:color w:val="000000"/>
+        </w:rPr>
+      </w:pPr>
+      <w:r>
+        <w:rPr>
+          <w:rtl w:val="0"/>
+        </w:rPr>
+      </w:r>
+    </w:p>
+    <w:p>
+      <w:pPr>
+        <w:numPr>
+          <w:ilvl w:val="0"/>
+          <w:numId w:val="14"/>
+        </w:numPr>
+        <w:spacing w:after="0" w:afterAutospacing="0"/>
+        <w:ind w:left="720" w:hanging="360"/>
+        <w:rPr>
+          <w:rFonts w:ascii="Calibri" w:cs="Calibri" w:eastAsia="Calibri" w:hAnsi="Calibri"/>
+          <w:sz w:val="24"/>
+          <w:szCs w:val="24"/>
+        </w:rPr>
+      </w:pPr>
+      <w:r>
+        <w:rPr>
+          <w:rFonts w:ascii="Calibri" w:cs="Calibri" w:eastAsia="Calibri" w:hAnsi="Calibri"/>
+          <w:sz w:val="24"/>
+          <w:szCs w:val="24"/>
+          <w:rtl w:val="0"/>
+        </w:rPr>
+        <w:t xml:space="preserve">Single material product ID (primary key)</w:t>
+      </w:r>
+    </w:p>
+    <w:p>
+      <w:pPr>
+        <w:numPr>
+          <w:ilvl w:val="0"/>
+          <w:numId w:val="14"/>
+        </w:numPr>
+        <w:spacing w:after="0" w:lineRule="auto"/>
+        <w:ind w:left="720" w:hanging="360"/>
+        <w:rPr>
+          <w:rFonts w:ascii="Calibri" w:cs="Calibri" w:eastAsia="Calibri" w:hAnsi="Calibri"/>
+          <w:sz w:val="24"/>
+          <w:szCs w:val="24"/>
+        </w:rPr>
+      </w:pPr>
+      <w:r>
+        <w:rPr>
+          <w:rFonts w:ascii="Calibri" w:cs="Calibri" w:eastAsia="Calibri" w:hAnsi="Calibri"/>
+          <w:sz w:val="24"/>
+          <w:szCs w:val="24"/>
+          <w:rtl w:val="0"/>
+        </w:rPr>
+        <w:t xml:space="preserve">Manufacturer ID (foreign key references entity Manufacturer)</w:t>
+      </w:r>
+    </w:p>
+    <w:p>
+      <w:pPr>
+        <w:numPr>
+          <w:ilvl w:val="0"/>
+          <w:numId w:val="14"/>
+        </w:numPr>
+        <w:spacing w:after="0" w:lineRule="auto"/>
+        <w:ind w:left="720" w:hanging="360"/>
+        <w:rPr>
+          <w:rFonts w:ascii="Calibri" w:cs="Calibri" w:eastAsia="Calibri" w:hAnsi="Calibri"/>
           <w:sz w:val="24"/>
           <w:szCs w:val="24"/>
           <w:u w:val="none"/>
-          <w:shd w:fill="auto" w:val="clear"/>
-          <w:vertAlign w:val="baseline"/>
-          <w:rtl w:val="0"/>
-        </w:rPr>
-        <w:t xml:space="preserve">)</w:t>
-      </w:r>
-    </w:p>
-    <w:p>
-      <w:pPr>
-        <w:keepNext w:val="0"/>
-        <w:keepLines w:val="0"/>
-        <w:pageBreakBefore w:val="0"/>
-        <w:widowControl w:val="1"/>
+        </w:rPr>
+      </w:pPr>
+      <w:r>
+        <w:rPr>
+          <w:rFonts w:ascii="Calibri" w:cs="Calibri" w:eastAsia="Calibri" w:hAnsi="Calibri"/>
+          <w:sz w:val="24"/>
+          <w:szCs w:val="24"/>
+          <w:rtl w:val="0"/>
+        </w:rPr>
+        <w:t xml:space="preserve">Brand name - text</w:t>
+      </w:r>
+    </w:p>
+    <w:p>
+      <w:pPr>
+        <w:numPr>
+          <w:ilvl w:val="0"/>
+          <w:numId w:val="14"/>
+        </w:numPr>
+        <w:ind w:left="720" w:hanging="360"/>
+        <w:rPr>
+          <w:rFonts w:ascii="Calibri" w:cs="Calibri" w:eastAsia="Calibri" w:hAnsi="Calibri"/>
+          <w:sz w:val="24"/>
+          <w:szCs w:val="24"/>
+        </w:rPr>
+      </w:pPr>
+      <w:r>
+        <w:rPr>
+          <w:rFonts w:ascii="Calibri" w:cs="Calibri" w:eastAsia="Calibri" w:hAnsi="Calibri"/>
+          <w:sz w:val="24"/>
+          <w:szCs w:val="24"/>
+          <w:rtl w:val="0"/>
+        </w:rPr>
+        <w:t xml:space="preserve">Material type - text</w:t>
+      </w:r>
+    </w:p>
+    <w:p>
+      <w:pPr>
+        <w:rPr>
+          <w:rFonts w:ascii="Calibri" w:cs="Calibri" w:eastAsia="Calibri" w:hAnsi="Calibri"/>
+          <w:sz w:val="24"/>
+          <w:szCs w:val="24"/>
+        </w:rPr>
+      </w:pPr>
+      <w:r>
+        <w:rPr>
+          <w:rFonts w:ascii="Calibri" w:cs="Calibri" w:eastAsia="Calibri" w:hAnsi="Calibri"/>
+          <w:sz w:val="24"/>
+          <w:szCs w:val="24"/>
+          <w:rtl w:val="0"/>
+        </w:rPr>
+        <w:t xml:space="preserve">Entity Manufacturer:</w:t>
+      </w:r>
+    </w:p>
+    <w:p>
+      <w:pPr>
         <w:numPr>
           <w:ilvl w:val="0"/>
           <w:numId w:val="8"/>
         </w:numPr>
-        <w:pBdr>
-          <w:top w:space="0" w:sz="0" w:val="nil"/>
-          <w:left w:space="0" w:sz="0" w:val="nil"/>
-          <w:bottom w:space="0" w:sz="0" w:val="nil"/>
-          <w:right w:space="0" w:sz="0" w:val="nil"/>
-          <w:between w:space="0" w:sz="0" w:val="nil"/>
-        </w:pBdr>
-        <w:shd w:fill="auto" w:val="clear"/>
-        <w:spacing w:after="0" w:before="0" w:line="259" w:lineRule="auto"/>
-        <w:ind w:left="720" w:right="0" w:hanging="360"/>
-        <w:jc w:val="left"/>
-        <w:rPr>
-          <w:rFonts w:ascii="Calibri" w:cs="Calibri" w:eastAsia="Calibri" w:hAnsi="Calibri"/>
-          <w:b w:val="0"/>
-          <w:bCs w:val="0"/>
-          <w:i w:val="0"/>
-          <w:iCs w:val="0"/>
-          <w:smallCaps w:val="0"/>
-          <w:strike w:val="0"/>
-          <w:color w:val="000000"/>
+        <w:spacing w:after="0" w:lineRule="auto"/>
+        <w:ind w:left="720" w:hanging="360"/>
+        <w:rPr>
+          <w:rFonts w:ascii="Calibri" w:cs="Calibri" w:eastAsia="Calibri" w:hAnsi="Calibri"/>
+          <w:sz w:val="24"/>
+          <w:szCs w:val="24"/>
+        </w:rPr>
+      </w:pPr>
+      <w:r>
+        <w:rPr>
+          <w:rFonts w:ascii="Calibri" w:cs="Calibri" w:eastAsia="Calibri" w:hAnsi="Calibri"/>
+          <w:sz w:val="24"/>
+          <w:szCs w:val="24"/>
+          <w:rtl w:val="0"/>
+        </w:rPr>
+        <w:t xml:space="preserve">Manufacturer ID (primary key)</w:t>
+      </w:r>
+    </w:p>
+    <w:p>
+      <w:pPr>
+        <w:numPr>
+          <w:ilvl w:val="0"/>
+          <w:numId w:val="8"/>
+        </w:numPr>
+        <w:ind w:left="720" w:hanging="360"/>
+        <w:rPr>
+          <w:rFonts w:ascii="Calibri" w:cs="Calibri" w:eastAsia="Calibri" w:hAnsi="Calibri"/>
+          <w:sz w:val="24"/>
+          <w:szCs w:val="24"/>
+        </w:rPr>
+      </w:pPr>
+      <w:r>
+        <w:rPr>
+          <w:rFonts w:ascii="Calibri" w:cs="Calibri" w:eastAsia="Calibri" w:hAnsi="Calibri"/>
+          <w:sz w:val="24"/>
+          <w:szCs w:val="24"/>
+          <w:rtl w:val="0"/>
+        </w:rPr>
+        <w:t xml:space="preserve">Company name - text</w:t>
+      </w:r>
+    </w:p>
+    <w:p>
+      <w:pPr>
+        <w:rPr>
+          <w:rFonts w:ascii="Calibri" w:cs="Calibri" w:eastAsia="Calibri" w:hAnsi="Calibri"/>
+          <w:sz w:val="24"/>
+          <w:szCs w:val="24"/>
+        </w:rPr>
+      </w:pPr>
+      <w:r>
+        <w:rPr>
+          <w:rFonts w:ascii="Calibri" w:cs="Calibri" w:eastAsia="Calibri" w:hAnsi="Calibri"/>
+          <w:sz w:val="24"/>
+          <w:szCs w:val="24"/>
+          <w:rtl w:val="0"/>
+        </w:rPr>
+        <w:t xml:space="preserve">Entity VehicleSchedule:</w:t>
+      </w:r>
+    </w:p>
+    <w:p>
+      <w:pPr>
+        <w:numPr>
+          <w:ilvl w:val="0"/>
+          <w:numId w:val="4"/>
+        </w:numPr>
+        <w:spacing w:after="0" w:afterAutospacing="0"/>
+        <w:ind w:left="720" w:hanging="360"/>
+        <w:rPr>
+          <w:rFonts w:ascii="Calibri" w:cs="Calibri" w:eastAsia="Calibri" w:hAnsi="Calibri"/>
+          <w:sz w:val="24"/>
+          <w:szCs w:val="24"/>
+        </w:rPr>
+      </w:pPr>
+      <w:r>
+        <w:rPr>
+          <w:rFonts w:ascii="Calibri" w:cs="Calibri" w:eastAsia="Calibri" w:hAnsi="Calibri"/>
+          <w:sz w:val="24"/>
+          <w:szCs w:val="24"/>
+          <w:rtl w:val="0"/>
+        </w:rPr>
+        <w:t xml:space="preserve">VehicleSchedule relates Vehicle (m:1)</w:t>
+      </w:r>
+    </w:p>
+    <w:p>
+      <w:pPr>
+        <w:numPr>
+          <w:ilvl w:val="0"/>
+          <w:numId w:val="4"/>
+        </w:numPr>
+        <w:spacing w:after="0" w:afterAutospacing="0"/>
+        <w:ind w:left="720" w:hanging="360"/>
+        <w:rPr>
+          <w:rFonts w:ascii="Calibri" w:cs="Calibri" w:eastAsia="Calibri" w:hAnsi="Calibri"/>
+          <w:sz w:val="24"/>
+          <w:szCs w:val="24"/>
+        </w:rPr>
+      </w:pPr>
+      <w:r>
+        <w:rPr>
+          <w:rFonts w:ascii="Calibri" w:cs="Calibri" w:eastAsia="Calibri" w:hAnsi="Calibri"/>
+          <w:sz w:val="24"/>
+          <w:szCs w:val="24"/>
+          <w:rtl w:val="0"/>
+        </w:rPr>
+        <w:t xml:space="preserve">VehicleSchedule relates Driver (m:1)</w:t>
+      </w:r>
+    </w:p>
+    <w:p>
+      <w:pPr>
+        <w:numPr>
+          <w:ilvl w:val="0"/>
+          <w:numId w:val="4"/>
+        </w:numPr>
+        <w:spacing w:after="0" w:afterAutospacing="0"/>
+        <w:ind w:left="720" w:hanging="360"/>
+        <w:rPr>
+          <w:rFonts w:ascii="Calibri" w:cs="Calibri" w:eastAsia="Calibri" w:hAnsi="Calibri"/>
+          <w:sz w:val="24"/>
+          <w:szCs w:val="24"/>
+        </w:rPr>
+      </w:pPr>
+      <w:r>
+        <w:rPr>
+          <w:rFonts w:ascii="Calibri" w:cs="Calibri" w:eastAsia="Calibri" w:hAnsi="Calibri"/>
+          <w:sz w:val="24"/>
+          <w:szCs w:val="24"/>
+          <w:rtl w:val="0"/>
+        </w:rPr>
+        <w:t xml:space="preserve">VehicleSchedule relates ConstructionSchedule (m:1)</w:t>
+      </w:r>
+    </w:p>
+    <w:p>
+      <w:pPr>
+        <w:numPr>
+          <w:ilvl w:val="0"/>
+          <w:numId w:val="4"/>
+        </w:numPr>
+        <w:spacing w:after="0" w:afterAutospacing="0"/>
+        <w:ind w:left="720" w:hanging="360"/>
+        <w:rPr>
+          <w:rFonts w:ascii="Calibri" w:cs="Calibri" w:eastAsia="Calibri" w:hAnsi="Calibri"/>
+          <w:sz w:val="24"/>
+          <w:szCs w:val="24"/>
+        </w:rPr>
+      </w:pPr>
+      <w:r>
+        <w:rPr>
+          <w:rtl w:val="0"/>
+        </w:rPr>
+      </w:r>
+    </w:p>
+    <w:p>
+      <w:pPr>
+        <w:numPr>
+          <w:ilvl w:val="0"/>
+          <w:numId w:val="8"/>
+        </w:numPr>
+        <w:spacing w:after="0" w:lineRule="auto"/>
+        <w:ind w:left="720" w:hanging="360"/>
+        <w:rPr>
+          <w:rFonts w:ascii="Calibri" w:cs="Calibri" w:eastAsia="Calibri" w:hAnsi="Calibri"/>
+          <w:sz w:val="24"/>
+          <w:szCs w:val="24"/>
+        </w:rPr>
+      </w:pPr>
+      <w:r>
+        <w:rPr>
+          <w:rFonts w:ascii="Calibri" w:cs="Calibri" w:eastAsia="Calibri" w:hAnsi="Calibri"/>
+          <w:sz w:val="24"/>
+          <w:szCs w:val="24"/>
+          <w:rtl w:val="0"/>
+        </w:rPr>
+        <w:t xml:space="preserve">Vehicle schedule ID (primary key)</w:t>
+      </w:r>
+    </w:p>
+    <w:p>
+      <w:pPr>
+        <w:numPr>
+          <w:ilvl w:val="0"/>
+          <w:numId w:val="8"/>
+        </w:numPr>
+        <w:spacing w:after="0" w:lineRule="auto"/>
+        <w:ind w:left="720" w:hanging="360"/>
+        <w:rPr>
+          <w:rFonts w:ascii="Calibri" w:cs="Calibri" w:eastAsia="Calibri" w:hAnsi="Calibri"/>
+          <w:sz w:val="24"/>
+          <w:szCs w:val="24"/>
+        </w:rPr>
+      </w:pPr>
+      <w:r>
+        <w:rPr>
+          <w:rFonts w:ascii="Calibri" w:cs="Calibri" w:eastAsia="Calibri" w:hAnsi="Calibri"/>
+          <w:sz w:val="24"/>
+          <w:szCs w:val="24"/>
+          <w:rtl w:val="0"/>
+        </w:rPr>
+        <w:t xml:space="preserve">Vehicle ID (foreign key references entity Vehicle)</w:t>
+      </w:r>
+    </w:p>
+    <w:p>
+      <w:pPr>
+        <w:numPr>
+          <w:ilvl w:val="0"/>
+          <w:numId w:val="8"/>
+        </w:numPr>
+        <w:spacing w:after="0" w:lineRule="auto"/>
+        <w:ind w:left="720" w:hanging="360"/>
+        <w:rPr>
+          <w:rFonts w:ascii="Calibri" w:cs="Calibri" w:eastAsia="Calibri" w:hAnsi="Calibri"/>
           <w:sz w:val="24"/>
           <w:szCs w:val="24"/>
           <w:u w:val="none"/>
-          <w:shd w:fill="auto" w:val="clear"/>
-          <w:vertAlign w:val="baseline"/>
-        </w:rPr>
-      </w:pPr>
-      <w:r>
-        <w:rPr>
-          <w:rFonts w:ascii="Calibri" w:cs="Calibri" w:eastAsia="Calibri" w:hAnsi="Calibri"/>
-          <w:b w:val="0"/>
-          <w:bCs w:val="0"/>
-          <w:i w:val="0"/>
-          <w:iCs w:val="0"/>
-          <w:smallCaps w:val="0"/>
-          <w:strike w:val="0"/>
-          <w:color w:val="000000"/>
+        </w:rPr>
+      </w:pPr>
+      <w:r>
+        <w:rPr>
+          <w:rFonts w:ascii="Calibri" w:cs="Calibri" w:eastAsia="Calibri" w:hAnsi="Calibri"/>
+          <w:sz w:val="24"/>
+          <w:szCs w:val="24"/>
+          <w:rtl w:val="0"/>
+        </w:rPr>
+        <w:t xml:space="preserve">Driver ID (foreign key references entity Driver)</w:t>
+      </w:r>
+    </w:p>
+    <w:p>
+      <w:pPr>
+        <w:numPr>
+          <w:ilvl w:val="0"/>
+          <w:numId w:val="8"/>
+        </w:numPr>
+        <w:spacing w:after="0" w:lineRule="auto"/>
+        <w:ind w:left="720" w:hanging="360"/>
+        <w:rPr>
+          <w:rFonts w:ascii="Calibri" w:cs="Calibri" w:eastAsia="Calibri" w:hAnsi="Calibri"/>
           <w:sz w:val="24"/>
           <w:szCs w:val="24"/>
           <w:u w:val="none"/>
-          <w:shd w:fill="auto" w:val="clear"/>
-          <w:vertAlign w:val="baseline"/>
-          <w:rtl w:val="0"/>
-        </w:rPr>
-        <w:t xml:space="preserve">Date </w:t>
-      </w:r>
-      <w:r>
-        <w:rPr>
-          <w:rFonts w:ascii="Calibri" w:cs="Calibri" w:eastAsia="Calibri" w:hAnsi="Calibri"/>
-          <w:sz w:val="24"/>
-          <w:szCs w:val="24"/>
-          <w:rtl w:val="0"/>
-        </w:rPr>
-        <w:t xml:space="preserve">- text</w:t>
-      </w:r>
-      <w:r>
-        <w:rPr>
-          <w:rtl w:val="0"/>
-        </w:rPr>
-      </w:r>
-    </w:p>
-    <w:p>
-      <w:pPr>
-        <w:keepNext w:val="0"/>
-        <w:keepLines w:val="0"/>
-        <w:pageBreakBefore w:val="0"/>
-        <w:widowControl w:val="1"/>
+        </w:rPr>
+      </w:pPr>
+      <w:r>
+        <w:rPr>
+          <w:rFonts w:ascii="Calibri" w:cs="Calibri" w:eastAsia="Calibri" w:hAnsi="Calibri"/>
+          <w:sz w:val="24"/>
+          <w:szCs w:val="24"/>
+          <w:rtl w:val="0"/>
+        </w:rPr>
+        <w:t xml:space="preserve">ConstructionSchedule ID (foreign key references entity ConstructionSchedule)</w:t>
+      </w:r>
+    </w:p>
+    <w:p>
+      <w:pPr>
         <w:numPr>
           <w:ilvl w:val="0"/>
           <w:numId w:val="8"/>
         </w:numPr>
-        <w:pBdr>
-          <w:top w:space="0" w:sz="0" w:val="nil"/>
-          <w:left w:space="0" w:sz="0" w:val="nil"/>
-          <w:bottom w:space="0" w:sz="0" w:val="nil"/>
-          <w:right w:space="0" w:sz="0" w:val="nil"/>
-          <w:between w:space="0" w:sz="0" w:val="nil"/>
-        </w:pBdr>
-        <w:shd w:fill="auto" w:val="clear"/>
-        <w:spacing w:after="160" w:before="0" w:line="259" w:lineRule="auto"/>
-        <w:ind w:left="720" w:right="0" w:hanging="360"/>
-        <w:jc w:val="left"/>
-        <w:rPr>
-          <w:rFonts w:ascii="Calibri" w:cs="Calibri" w:eastAsia="Calibri" w:hAnsi="Calibri"/>
-          <w:b w:val="0"/>
-          <w:bCs w:val="0"/>
-          <w:i w:val="0"/>
-          <w:iCs w:val="0"/>
-          <w:smallCaps w:val="0"/>
-          <w:strike w:val="0"/>
-          <w:color w:val="000000"/>
+        <w:spacing w:after="0" w:lineRule="auto"/>
+        <w:ind w:left="720" w:hanging="360"/>
+        <w:rPr>
+          <w:rFonts w:ascii="Calibri" w:cs="Calibri" w:eastAsia="Calibri" w:hAnsi="Calibri"/>
+          <w:sz w:val="24"/>
+          <w:szCs w:val="24"/>
+        </w:rPr>
+      </w:pPr>
+      <w:r>
+        <w:rPr>
+          <w:rFonts w:ascii="Calibri" w:cs="Calibri" w:eastAsia="Calibri" w:hAnsi="Calibri"/>
+          <w:sz w:val="24"/>
+          <w:szCs w:val="24"/>
+          <w:rtl w:val="0"/>
+        </w:rPr>
+        <w:t xml:space="preserve">Date of start - text</w:t>
+      </w:r>
+    </w:p>
+    <w:p>
+      <w:pPr>
+        <w:numPr>
+          <w:ilvl w:val="0"/>
+          <w:numId w:val="8"/>
+        </w:numPr>
+        <w:ind w:left="720" w:hanging="360"/>
+        <w:rPr>
+          <w:rFonts w:ascii="Calibri" w:cs="Calibri" w:eastAsia="Calibri" w:hAnsi="Calibri"/>
+          <w:sz w:val="24"/>
+          <w:szCs w:val="24"/>
+        </w:rPr>
+      </w:pPr>
+      <w:r>
+        <w:rPr>
+          <w:rFonts w:ascii="Calibri" w:cs="Calibri" w:eastAsia="Calibri" w:hAnsi="Calibri"/>
+          <w:sz w:val="24"/>
+          <w:szCs w:val="24"/>
+          <w:rtl w:val="0"/>
+        </w:rPr>
+        <w:t xml:space="preserve">Date of end - text</w:t>
+      </w:r>
+    </w:p>
+    <w:p>
+      <w:pPr>
+        <w:rPr>
+          <w:rFonts w:ascii="Calibri" w:cs="Calibri" w:eastAsia="Calibri" w:hAnsi="Calibri"/>
+          <w:sz w:val="24"/>
+          <w:szCs w:val="24"/>
+        </w:rPr>
+      </w:pPr>
+      <w:r>
+        <w:rPr>
+          <w:rFonts w:ascii="Calibri" w:cs="Calibri" w:eastAsia="Calibri" w:hAnsi="Calibri"/>
+          <w:sz w:val="24"/>
+          <w:szCs w:val="24"/>
+          <w:rtl w:val="0"/>
+        </w:rPr>
+        <w:t xml:space="preserve">Entity OfficeWorkspaceSchedule:</w:t>
+      </w:r>
+    </w:p>
+    <w:p>
+      <w:pPr>
+        <w:numPr>
+          <w:ilvl w:val="0"/>
+          <w:numId w:val="6"/>
+        </w:numPr>
+        <w:spacing w:after="0" w:afterAutospacing="0"/>
+        <w:ind w:left="720" w:hanging="360"/>
+        <w:rPr>
+          <w:rFonts w:ascii="Calibri" w:cs="Calibri" w:eastAsia="Calibri" w:hAnsi="Calibri"/>
+          <w:sz w:val="24"/>
+          <w:szCs w:val="24"/>
+        </w:rPr>
+      </w:pPr>
+      <w:r>
+        <w:rPr>
+          <w:rFonts w:ascii="Calibri" w:cs="Calibri" w:eastAsia="Calibri" w:hAnsi="Calibri"/>
+          <w:sz w:val="24"/>
+          <w:szCs w:val="24"/>
+          <w:rtl w:val="0"/>
+        </w:rPr>
+        <w:t xml:space="preserve">OfficeWorkspaceSchedule relates OfficeWorker (m:1)</w:t>
+      </w:r>
+    </w:p>
+    <w:p>
+      <w:pPr>
+        <w:numPr>
+          <w:ilvl w:val="0"/>
+          <w:numId w:val="6"/>
+        </w:numPr>
+        <w:spacing w:after="0" w:afterAutospacing="0"/>
+        <w:ind w:left="720" w:hanging="360"/>
+        <w:rPr>
+          <w:rFonts w:ascii="Calibri" w:cs="Calibri" w:eastAsia="Calibri" w:hAnsi="Calibri"/>
+          <w:sz w:val="24"/>
+          <w:szCs w:val="24"/>
+        </w:rPr>
+      </w:pPr>
+      <w:r>
+        <w:rPr>
+          <w:rFonts w:ascii="Calibri" w:cs="Calibri" w:eastAsia="Calibri" w:hAnsi="Calibri"/>
+          <w:sz w:val="24"/>
+          <w:szCs w:val="24"/>
+          <w:rtl w:val="0"/>
+        </w:rPr>
+        <w:t xml:space="preserve">OfficeWorkspaceSchedule relates OfficeWorkspaceChair (m:1)</w:t>
+      </w:r>
+    </w:p>
+    <w:p>
+      <w:pPr>
+        <w:numPr>
+          <w:ilvl w:val="0"/>
+          <w:numId w:val="6"/>
+        </w:numPr>
+        <w:spacing w:after="0" w:afterAutospacing="0"/>
+        <w:ind w:left="720" w:hanging="360"/>
+        <w:rPr>
+          <w:rFonts w:ascii="Calibri" w:cs="Calibri" w:eastAsia="Calibri" w:hAnsi="Calibri"/>
+          <w:sz w:val="24"/>
+          <w:szCs w:val="24"/>
+        </w:rPr>
+      </w:pPr>
+      <w:r>
+        <w:rPr>
+          <w:rtl w:val="0"/>
+        </w:rPr>
+      </w:r>
+    </w:p>
+    <w:p>
+      <w:pPr>
+        <w:numPr>
+          <w:ilvl w:val="0"/>
+          <w:numId w:val="6"/>
+        </w:numPr>
+        <w:spacing w:after="0" w:afterAutospacing="0"/>
+        <w:ind w:left="720" w:hanging="360"/>
+        <w:rPr>
+          <w:rFonts w:ascii="Calibri" w:cs="Calibri" w:eastAsia="Calibri" w:hAnsi="Calibri"/>
+          <w:sz w:val="24"/>
+          <w:szCs w:val="24"/>
+        </w:rPr>
+      </w:pPr>
+      <w:r>
+        <w:rPr>
+          <w:rFonts w:ascii="Calibri" w:cs="Calibri" w:eastAsia="Calibri" w:hAnsi="Calibri"/>
+          <w:sz w:val="24"/>
+          <w:szCs w:val="24"/>
+          <w:rtl w:val="0"/>
+        </w:rPr>
+        <w:t xml:space="preserve">Office workspace schedule ID (primary key)</w:t>
+      </w:r>
+    </w:p>
+    <w:p>
+      <w:pPr>
+        <w:numPr>
+          <w:ilvl w:val="0"/>
+          <w:numId w:val="6"/>
+        </w:numPr>
+        <w:spacing w:after="0" w:afterAutospacing="0"/>
+        <w:ind w:left="720" w:hanging="360"/>
+        <w:rPr>
+          <w:rFonts w:ascii="Calibri" w:cs="Calibri" w:eastAsia="Calibri" w:hAnsi="Calibri"/>
+          <w:sz w:val="24"/>
+          <w:szCs w:val="24"/>
+        </w:rPr>
+      </w:pPr>
+      <w:r>
+        <w:rPr>
+          <w:rFonts w:ascii="Calibri" w:cs="Calibri" w:eastAsia="Calibri" w:hAnsi="Calibri"/>
+          <w:sz w:val="24"/>
+          <w:szCs w:val="24"/>
+          <w:rtl w:val="0"/>
+        </w:rPr>
+        <w:t xml:space="preserve">Office worker ID (foreign key references entity OfficeWorker)</w:t>
+      </w:r>
+    </w:p>
+    <w:p>
+      <w:pPr>
+        <w:numPr>
+          <w:ilvl w:val="0"/>
+          <w:numId w:val="6"/>
+        </w:numPr>
+        <w:spacing w:after="0" w:afterAutospacing="0"/>
+        <w:ind w:left="720" w:hanging="360"/>
+        <w:rPr>
+          <w:rFonts w:ascii="Calibri" w:cs="Calibri" w:eastAsia="Calibri" w:hAnsi="Calibri"/>
+          <w:sz w:val="24"/>
+          <w:szCs w:val="24"/>
+        </w:rPr>
+      </w:pPr>
+      <w:r>
+        <w:rPr>
+          <w:rFonts w:ascii="Calibri" w:cs="Calibri" w:eastAsia="Calibri" w:hAnsi="Calibri"/>
+          <w:sz w:val="24"/>
+          <w:szCs w:val="24"/>
+          <w:rtl w:val="0"/>
+        </w:rPr>
+        <w:t xml:space="preserve">Office workspace chair ID (foreign key references entity OfficeWorkspaceChair)</w:t>
+      </w:r>
+    </w:p>
+    <w:p>
+      <w:pPr>
+        <w:numPr>
+          <w:ilvl w:val="0"/>
+          <w:numId w:val="6"/>
+        </w:numPr>
+        <w:ind w:left="720" w:hanging="360"/>
+        <w:rPr>
+          <w:rFonts w:ascii="Calibri" w:cs="Calibri" w:eastAsia="Calibri" w:hAnsi="Calibri"/>
+          <w:sz w:val="24"/>
+          <w:szCs w:val="24"/>
+        </w:rPr>
+      </w:pPr>
+      <w:r>
+        <w:rPr>
+          <w:rFonts w:ascii="Calibri" w:cs="Calibri" w:eastAsia="Calibri" w:hAnsi="Calibri"/>
+          <w:sz w:val="24"/>
+          <w:szCs w:val="24"/>
+          <w:rtl w:val="0"/>
+        </w:rPr>
+        <w:t xml:space="preserve">Duration - integer</w:t>
+      </w:r>
+    </w:p>
+    <w:p>
+      <w:pPr>
+        <w:rPr>
+          <w:rFonts w:ascii="Calibri" w:cs="Calibri" w:eastAsia="Calibri" w:hAnsi="Calibri"/>
+          <w:sz w:val="24"/>
+          <w:szCs w:val="24"/>
+        </w:rPr>
+      </w:pPr>
+      <w:r>
+        <w:rPr>
+          <w:rFonts w:ascii="Calibri" w:cs="Calibri" w:eastAsia="Calibri" w:hAnsi="Calibri"/>
+          <w:sz w:val="24"/>
+          <w:szCs w:val="24"/>
+          <w:rtl w:val="0"/>
+        </w:rPr>
+        <w:t xml:space="preserve">Entity ConstructionSchedule:</w:t>
+      </w:r>
+    </w:p>
+    <w:p>
+      <w:pPr>
+        <w:numPr>
+          <w:ilvl w:val="0"/>
+          <w:numId w:val="1"/>
+        </w:numPr>
+        <w:spacing w:after="0" w:afterAutospacing="0"/>
+        <w:ind w:left="720" w:hanging="360"/>
+        <w:rPr>
+          <w:rFonts w:ascii="Calibri" w:cs="Calibri" w:eastAsia="Calibri" w:hAnsi="Calibri"/>
+          <w:sz w:val="24"/>
+          <w:szCs w:val="24"/>
+        </w:rPr>
+      </w:pPr>
+      <w:r>
+        <w:rPr>
+          <w:rFonts w:ascii="Calibri" w:cs="Calibri" w:eastAsia="Calibri" w:hAnsi="Calibri"/>
+          <w:sz w:val="24"/>
+          <w:szCs w:val="24"/>
+          <w:rtl w:val="0"/>
+        </w:rPr>
+        <w:t xml:space="preserve">ConstructionSchedule relates ConstructionWorker (m:n)</w:t>
+      </w:r>
+    </w:p>
+    <w:p>
+      <w:pPr>
+        <w:numPr>
+          <w:ilvl w:val="0"/>
+          <w:numId w:val="1"/>
+        </w:numPr>
+        <w:spacing w:after="0" w:afterAutospacing="0"/>
+        <w:ind w:left="720" w:hanging="360"/>
+        <w:rPr>
+          <w:rFonts w:ascii="Calibri" w:cs="Calibri" w:eastAsia="Calibri" w:hAnsi="Calibri"/>
+          <w:sz w:val="24"/>
+          <w:szCs w:val="24"/>
+        </w:rPr>
+      </w:pPr>
+      <w:r>
+        <w:rPr>
+          <w:rFonts w:ascii="Calibri" w:cs="Calibri" w:eastAsia="Calibri" w:hAnsi="Calibri"/>
+          <w:sz w:val="24"/>
+          <w:szCs w:val="24"/>
+          <w:rtl w:val="0"/>
+        </w:rPr>
+        <w:t xml:space="preserve">ConstructionSchedule relates ConstructionLocation (1:n) // because it can be that one location has multiple schedules over time</w:t>
+      </w:r>
+    </w:p>
+    <w:p>
+      <w:pPr>
+        <w:numPr>
+          <w:ilvl w:val="0"/>
+          <w:numId w:val="1"/>
+        </w:numPr>
+        <w:spacing w:after="0" w:afterAutospacing="0"/>
+        <w:ind w:left="720" w:hanging="360"/>
+        <w:rPr>
+          <w:rFonts w:ascii="Calibri" w:cs="Calibri" w:eastAsia="Calibri" w:hAnsi="Calibri"/>
+          <w:sz w:val="24"/>
+          <w:szCs w:val="24"/>
+        </w:rPr>
+      </w:pPr>
+      <w:r>
+        <w:rPr>
+          <w:rtl w:val="0"/>
+        </w:rPr>
+      </w:r>
+    </w:p>
+    <w:p>
+      <w:pPr>
+        <w:numPr>
+          <w:ilvl w:val="0"/>
+          <w:numId w:val="1"/>
+        </w:numPr>
+        <w:spacing w:after="0" w:afterAutospacing="0"/>
+        <w:ind w:left="720" w:hanging="360"/>
+        <w:rPr>
+          <w:rFonts w:ascii="Calibri" w:cs="Calibri" w:eastAsia="Calibri" w:hAnsi="Calibri"/>
+          <w:sz w:val="24"/>
+          <w:szCs w:val="24"/>
+        </w:rPr>
+      </w:pPr>
+      <w:r>
+        <w:rPr>
+          <w:rFonts w:ascii="Calibri" w:cs="Calibri" w:eastAsia="Calibri" w:hAnsi="Calibri"/>
+          <w:sz w:val="24"/>
+          <w:szCs w:val="24"/>
+          <w:rtl w:val="0"/>
+        </w:rPr>
+        <w:t xml:space="preserve">Construction schedule ID (primary key)</w:t>
+      </w:r>
+    </w:p>
+    <w:p>
+      <w:pPr>
+        <w:numPr>
+          <w:ilvl w:val="0"/>
+          <w:numId w:val="1"/>
+        </w:numPr>
+        <w:spacing w:after="0" w:afterAutospacing="0"/>
+        <w:ind w:left="720" w:hanging="360"/>
+        <w:rPr>
+          <w:rFonts w:ascii="Calibri" w:cs="Calibri" w:eastAsia="Calibri" w:hAnsi="Calibri"/>
+          <w:sz w:val="24"/>
+          <w:szCs w:val="24"/>
+        </w:rPr>
+      </w:pPr>
+      <w:r>
+        <w:rPr>
+          <w:rFonts w:ascii="Calibri" w:cs="Calibri" w:eastAsia="Calibri" w:hAnsi="Calibri"/>
+          <w:sz w:val="24"/>
+          <w:szCs w:val="24"/>
+          <w:rtl w:val="0"/>
+        </w:rPr>
+        <w:t xml:space="preserve">Construction worker ID (foreign key references entity ConstructionWorker)</w:t>
+      </w:r>
+    </w:p>
+    <w:p>
+      <w:pPr>
+        <w:numPr>
+          <w:ilvl w:val="0"/>
+          <w:numId w:val="1"/>
+        </w:numPr>
+        <w:spacing w:after="0" w:afterAutospacing="0"/>
+        <w:ind w:left="720" w:hanging="360"/>
+        <w:rPr>
+          <w:rFonts w:ascii="Calibri" w:cs="Calibri" w:eastAsia="Calibri" w:hAnsi="Calibri"/>
+          <w:sz w:val="24"/>
+          <w:szCs w:val="24"/>
+        </w:rPr>
+      </w:pPr>
+      <w:r>
+        <w:rPr>
+          <w:rFonts w:ascii="Calibri" w:cs="Calibri" w:eastAsia="Calibri" w:hAnsi="Calibri"/>
+          <w:sz w:val="24"/>
+          <w:szCs w:val="24"/>
+          <w:rtl w:val="0"/>
+        </w:rPr>
+        <w:t xml:space="preserve">Construction location ID (foreign key references entity ConstructionLocation)</w:t>
+      </w:r>
+    </w:p>
+    <w:p>
+      <w:pPr>
+        <w:numPr>
+          <w:ilvl w:val="0"/>
+          <w:numId w:val="1"/>
+        </w:numPr>
+        <w:spacing w:after="0" w:afterAutospacing="0"/>
+        <w:ind w:left="720" w:hanging="360"/>
+        <w:rPr>
+          <w:rFonts w:ascii="Calibri" w:cs="Calibri" w:eastAsia="Calibri" w:hAnsi="Calibri"/>
           <w:sz w:val="24"/>
           <w:szCs w:val="24"/>
           <w:u w:val="none"/>
-          <w:shd w:fill="auto" w:val="clear"/>
-          <w:vertAlign w:val="baseline"/>
-        </w:rPr>
-      </w:pPr>
-      <w:r>
-        <w:rPr>
-          <w:rFonts w:ascii="Calibri" w:cs="Calibri" w:eastAsia="Calibri" w:hAnsi="Calibri"/>
-          <w:b w:val="0"/>
-          <w:bCs w:val="0"/>
-          <w:i w:val="0"/>
-          <w:iCs w:val="0"/>
-          <w:smallCaps w:val="0"/>
-          <w:strike w:val="0"/>
-          <w:color w:val="000000"/>
+        </w:rPr>
+      </w:pPr>
+      <w:r>
+        <w:rPr>
+          <w:rFonts w:ascii="Calibri" w:cs="Calibri" w:eastAsia="Calibri" w:hAnsi="Calibri"/>
+          <w:sz w:val="24"/>
+          <w:szCs w:val="24"/>
+          <w:rtl w:val="0"/>
+        </w:rPr>
+        <w:t xml:space="preserve">Order ID (foreign key references entity Order)</w:t>
+      </w:r>
+    </w:p>
+    <w:p>
+      <w:pPr>
+        <w:numPr>
+          <w:ilvl w:val="0"/>
+          <w:numId w:val="1"/>
+        </w:numPr>
+        <w:ind w:left="720" w:hanging="360"/>
+        <w:rPr>
+          <w:rFonts w:ascii="Calibri" w:cs="Calibri" w:eastAsia="Calibri" w:hAnsi="Calibri"/>
           <w:sz w:val="24"/>
           <w:szCs w:val="24"/>
           <w:u w:val="none"/>
-          <w:shd w:fill="auto" w:val="clear"/>
-          <w:vertAlign w:val="baseline"/>
-          <w:rtl w:val="0"/>
-        </w:rPr>
-        <w:t xml:space="preserve">Price </w:t>
-      </w:r>
-      <w:r>
-        <w:rPr>
-          <w:rFonts w:ascii="Calibri" w:cs="Calibri" w:eastAsia="Calibri" w:hAnsi="Calibri"/>
-          <w:sz w:val="24"/>
-          <w:szCs w:val="24"/>
-          <w:rtl w:val="0"/>
-        </w:rPr>
-        <w:t xml:space="preserve">- integer </w:t>
-      </w:r>
-      <w:r>
-        <w:rPr>
-          <w:rtl w:val="0"/>
-        </w:rPr>
-      </w:r>
-    </w:p>
-    <w:p>
-      <w:pPr>
-        <w:rPr>
-          <w:rFonts w:ascii="Calibri" w:cs="Calibri" w:eastAsia="Calibri" w:hAnsi="Calibri"/>
-          <w:sz w:val="24"/>
-          <w:szCs w:val="24"/>
-        </w:rPr>
-      </w:pPr>
-      <w:r>
-        <w:rPr>
-          <w:rFonts w:ascii="Calibri" w:cs="Calibri" w:eastAsia="Calibri" w:hAnsi="Calibri"/>
-          <w:sz w:val="24"/>
-          <w:szCs w:val="24"/>
-          <w:rtl w:val="0"/>
-        </w:rPr>
-        <w:t xml:space="preserve">Entity SingleMaterialProduct:</w:t>
-      </w:r>
-    </w:p>
-    <w:p>
-      <w:pPr>
-        <w:numPr>
-          <w:ilvl w:val="0"/>
-          <w:numId w:val="14"/>
+        </w:rPr>
+      </w:pPr>
+      <w:r>
+        <w:rPr>
+          <w:rFonts w:ascii="Calibri" w:cs="Calibri" w:eastAsia="Calibri" w:hAnsi="Calibri"/>
+          <w:sz w:val="24"/>
+          <w:szCs w:val="24"/>
+          <w:rtl w:val="0"/>
+        </w:rPr>
+        <w:t xml:space="preserve">Duration - integer</w:t>
+      </w:r>
+    </w:p>
+    <w:p>
+      <w:pPr>
+        <w:rPr>
+          <w:rFonts w:ascii="Calibri" w:cs="Calibri" w:eastAsia="Calibri" w:hAnsi="Calibri"/>
+          <w:sz w:val="24"/>
+          <w:szCs w:val="24"/>
+        </w:rPr>
+      </w:pPr>
+      <w:r>
+        <w:rPr>
+          <w:rFonts w:ascii="Calibri" w:cs="Calibri" w:eastAsia="Calibri" w:hAnsi="Calibri"/>
+          <w:sz w:val="24"/>
+          <w:szCs w:val="24"/>
+          <w:rtl w:val="0"/>
+        </w:rPr>
+        <w:t xml:space="preserve">Entity Employee:</w:t>
+      </w:r>
+    </w:p>
+    <w:p>
+      <w:pPr>
+        <w:numPr>
+          <w:ilvl w:val="0"/>
+          <w:numId w:val="8"/>
+        </w:numPr>
+        <w:spacing w:after="0" w:lineRule="auto"/>
+        <w:ind w:left="720" w:hanging="360"/>
+        <w:rPr>
+          <w:rFonts w:ascii="Calibri" w:cs="Calibri" w:eastAsia="Calibri" w:hAnsi="Calibri"/>
+          <w:sz w:val="24"/>
+          <w:szCs w:val="24"/>
+        </w:rPr>
+      </w:pPr>
+      <w:r>
+        <w:rPr>
+          <w:rFonts w:ascii="Calibri" w:cs="Calibri" w:eastAsia="Calibri" w:hAnsi="Calibri"/>
+          <w:sz w:val="24"/>
+          <w:szCs w:val="24"/>
+          <w:rtl w:val="0"/>
+        </w:rPr>
+        <w:t xml:space="preserve">Employee ID (primary key)</w:t>
+      </w:r>
+    </w:p>
+    <w:p>
+      <w:pPr>
+        <w:numPr>
+          <w:ilvl w:val="0"/>
+          <w:numId w:val="8"/>
+        </w:numPr>
+        <w:spacing w:after="0" w:lineRule="auto"/>
+        <w:ind w:left="720" w:hanging="360"/>
+        <w:rPr>
+          <w:rFonts w:ascii="Calibri" w:cs="Calibri" w:eastAsia="Calibri" w:hAnsi="Calibri"/>
+          <w:sz w:val="24"/>
+          <w:szCs w:val="24"/>
+        </w:rPr>
+      </w:pPr>
+      <w:r>
+        <w:rPr>
+          <w:rFonts w:ascii="Calibri" w:cs="Calibri" w:eastAsia="Calibri" w:hAnsi="Calibri"/>
+          <w:sz w:val="24"/>
+          <w:szCs w:val="24"/>
+          <w:rtl w:val="0"/>
+        </w:rPr>
+        <w:t xml:space="preserve">Name</w:t>
+      </w:r>
+    </w:p>
+    <w:p>
+      <w:pPr>
+        <w:numPr>
+          <w:ilvl w:val="0"/>
+          <w:numId w:val="8"/>
+        </w:numPr>
+        <w:spacing w:after="0" w:lineRule="auto"/>
+        <w:ind w:left="720" w:hanging="360"/>
+        <w:rPr>
+          <w:rFonts w:ascii="Calibri" w:cs="Calibri" w:eastAsia="Calibri" w:hAnsi="Calibri"/>
+          <w:sz w:val="24"/>
+          <w:szCs w:val="24"/>
+        </w:rPr>
+      </w:pPr>
+      <w:r>
+        <w:rPr>
+          <w:rFonts w:ascii="Calibri" w:cs="Calibri" w:eastAsia="Calibri" w:hAnsi="Calibri"/>
+          <w:sz w:val="24"/>
+          <w:szCs w:val="24"/>
+          <w:rtl w:val="0"/>
+        </w:rPr>
+        <w:t xml:space="preserve">Age</w:t>
+      </w:r>
+    </w:p>
+    <w:p>
+      <w:pPr>
+        <w:numPr>
+          <w:ilvl w:val="0"/>
+          <w:numId w:val="2"/>
         </w:numPr>
         <w:spacing w:after="0" w:afterAutospacing="0"/>
         <w:ind w:left="720" w:hanging="360"/>
@@ -712,14 +1703,55 @@
           <w:szCs w:val="24"/>
           <w:rtl w:val="0"/>
         </w:rPr>
-        <w:t xml:space="preserve">SingleMaterialProduct relates Manufacturer (1:1)</w:t>
-      </w:r>
-    </w:p>
-    <w:p>
-      <w:pPr>
-        <w:numPr>
-          <w:ilvl w:val="0"/>
-          <w:numId w:val="14"/>
+        <w:t xml:space="preserve">Gender</w:t>
+      </w:r>
+    </w:p>
+    <w:p>
+      <w:pPr>
+        <w:numPr>
+          <w:ilvl w:val="0"/>
+          <w:numId w:val="3"/>
+        </w:numPr>
+        <w:ind w:left="720" w:hanging="360"/>
+        <w:rPr>
+          <w:rFonts w:ascii="Calibri" w:cs="Calibri" w:eastAsia="Calibri" w:hAnsi="Calibri"/>
+          <w:sz w:val="24"/>
+          <w:szCs w:val="24"/>
+        </w:rPr>
+      </w:pPr>
+      <w:r>
+        <w:rPr>
+          <w:rFonts w:ascii="Calibri" w:cs="Calibri" w:eastAsia="Calibri" w:hAnsi="Calibri"/>
+          <w:sz w:val="24"/>
+          <w:szCs w:val="24"/>
+          <w:rtl w:val="0"/>
+        </w:rPr>
+        <w:t xml:space="preserve">Date of starting job</w:t>
+      </w:r>
+    </w:p>
+    <w:p>
+      <w:pPr>
+        <w:rPr>
+          <w:rFonts w:ascii="Calibri" w:cs="Calibri" w:eastAsia="Calibri" w:hAnsi="Calibri"/>
+          <w:sz w:val="24"/>
+          <w:szCs w:val="24"/>
+        </w:rPr>
+      </w:pPr>
+      <w:r>
+        <w:rPr>
+          <w:rFonts w:ascii="Calibri" w:cs="Calibri" w:eastAsia="Calibri" w:hAnsi="Calibri"/>
+          <w:sz w:val="24"/>
+          <w:szCs w:val="24"/>
+          <w:rtl w:val="0"/>
+        </w:rPr>
+        <w:t xml:space="preserve">Entity Driver:</w:t>
+      </w:r>
+    </w:p>
+    <w:p>
+      <w:pPr>
+        <w:numPr>
+          <w:ilvl w:val="0"/>
+          <w:numId w:val="5"/>
         </w:numPr>
         <w:spacing w:after="0" w:afterAutospacing="0"/>
         <w:ind w:left="720" w:hanging="360"/>
@@ -727,1126 +1759,171 @@
           <w:rFonts w:ascii="Calibri" w:cs="Calibri" w:eastAsia="Calibri" w:hAnsi="Calibri"/>
           <w:sz w:val="24"/>
           <w:szCs w:val="24"/>
+        </w:rPr>
+      </w:pPr>
+      <w:r>
+        <w:rPr>
+          <w:rFonts w:ascii="Calibri" w:cs="Calibri" w:eastAsia="Calibri" w:hAnsi="Calibri"/>
+          <w:sz w:val="24"/>
+          <w:szCs w:val="24"/>
+          <w:rtl w:val="0"/>
+        </w:rPr>
+        <w:t xml:space="preserve">Inherits Employee attributes</w:t>
+      </w:r>
+    </w:p>
+    <w:p>
+      <w:pPr>
+        <w:numPr>
+          <w:ilvl w:val="0"/>
+          <w:numId w:val="5"/>
+        </w:numPr>
+        <w:ind w:left="720" w:hanging="360"/>
+        <w:rPr>
+          <w:rFonts w:ascii="Calibri" w:cs="Calibri" w:eastAsia="Calibri" w:hAnsi="Calibri"/>
+          <w:sz w:val="24"/>
+          <w:szCs w:val="24"/>
+        </w:rPr>
+      </w:pPr>
+      <w:r>
+        <w:rPr>
+          <w:rFonts w:ascii="Calibri" w:cs="Calibri" w:eastAsia="Calibri" w:hAnsi="Calibri"/>
+          <w:sz w:val="24"/>
+          <w:szCs w:val="24"/>
+          <w:rtl w:val="0"/>
+        </w:rPr>
+        <w:t xml:space="preserve">Driver ID (primary key)</w:t>
+      </w:r>
+    </w:p>
+    <w:p>
+      <w:pPr>
+        <w:rPr>
+          <w:rFonts w:ascii="Calibri" w:cs="Calibri" w:eastAsia="Calibri" w:hAnsi="Calibri"/>
+          <w:sz w:val="24"/>
+          <w:szCs w:val="24"/>
+        </w:rPr>
+      </w:pPr>
+      <w:r>
+        <w:rPr>
+          <w:rFonts w:ascii="Calibri" w:cs="Calibri" w:eastAsia="Calibri" w:hAnsi="Calibri"/>
+          <w:sz w:val="24"/>
+          <w:szCs w:val="24"/>
+          <w:rtl w:val="0"/>
+        </w:rPr>
+        <w:t xml:space="preserve">Entity OfficeWorker:</w:t>
+      </w:r>
+    </w:p>
+    <w:p>
+      <w:pPr>
+        <w:numPr>
+          <w:ilvl w:val="0"/>
+          <w:numId w:val="11"/>
+        </w:numPr>
+        <w:spacing w:after="0" w:afterAutospacing="0"/>
+        <w:ind w:left="720" w:hanging="360"/>
+        <w:rPr>
+          <w:rFonts w:ascii="Calibri" w:cs="Calibri" w:eastAsia="Calibri" w:hAnsi="Calibri"/>
+          <w:sz w:val="24"/>
+          <w:szCs w:val="24"/>
+        </w:rPr>
+      </w:pPr>
+      <w:r>
+        <w:rPr>
+          <w:rFonts w:ascii="Calibri" w:cs="Calibri" w:eastAsia="Calibri" w:hAnsi="Calibri"/>
+          <w:sz w:val="24"/>
+          <w:szCs w:val="24"/>
+          <w:rtl w:val="0"/>
+        </w:rPr>
+        <w:t xml:space="preserve">Inherits Employee attributes</w:t>
+      </w:r>
+    </w:p>
+    <w:p>
+      <w:pPr>
+        <w:numPr>
+          <w:ilvl w:val="0"/>
+          <w:numId w:val="7"/>
+        </w:numPr>
+        <w:ind w:left="720" w:hanging="360"/>
+        <w:rPr>
+          <w:rFonts w:ascii="Calibri" w:cs="Calibri" w:eastAsia="Calibri" w:hAnsi="Calibri"/>
+          <w:sz w:val="24"/>
+          <w:szCs w:val="24"/>
+        </w:rPr>
+      </w:pPr>
+      <w:r>
+        <w:rPr>
+          <w:rFonts w:ascii="Calibri" w:cs="Calibri" w:eastAsia="Calibri" w:hAnsi="Calibri"/>
+          <w:sz w:val="24"/>
+          <w:szCs w:val="24"/>
+          <w:rtl w:val="0"/>
+        </w:rPr>
+        <w:t xml:space="preserve">Office worker ID (primary key)</w:t>
+      </w:r>
+    </w:p>
+    <w:p>
+      <w:pPr>
+        <w:rPr>
+          <w:rFonts w:ascii="Calibri" w:cs="Calibri" w:eastAsia="Calibri" w:hAnsi="Calibri"/>
+          <w:sz w:val="24"/>
+          <w:szCs w:val="24"/>
+        </w:rPr>
+      </w:pPr>
+      <w:r>
+        <w:rPr>
+          <w:rFonts w:ascii="Calibri" w:cs="Calibri" w:eastAsia="Calibri" w:hAnsi="Calibri"/>
+          <w:sz w:val="24"/>
+          <w:szCs w:val="24"/>
+          <w:rtl w:val="0"/>
+        </w:rPr>
+        <w:t xml:space="preserve">Entity ConstructionWorker:</w:t>
+      </w:r>
+    </w:p>
+    <w:p>
+      <w:pPr>
+        <w:numPr>
+          <w:ilvl w:val="0"/>
+          <w:numId w:val="5"/>
+        </w:numPr>
+        <w:spacing w:after="0" w:afterAutospacing="0"/>
+        <w:ind w:left="720" w:hanging="360"/>
+        <w:rPr>
+          <w:rFonts w:ascii="Calibri" w:cs="Calibri" w:eastAsia="Calibri" w:hAnsi="Calibri"/>
+          <w:sz w:val="24"/>
+          <w:szCs w:val="24"/>
+        </w:rPr>
+      </w:pPr>
+      <w:r>
+        <w:rPr>
+          <w:rFonts w:ascii="Calibri" w:cs="Calibri" w:eastAsia="Calibri" w:hAnsi="Calibri"/>
+          <w:sz w:val="24"/>
+          <w:szCs w:val="24"/>
+          <w:rtl w:val="0"/>
+        </w:rPr>
+        <w:t xml:space="preserve">Inherits Employee attributes</w:t>
+      </w:r>
+    </w:p>
+    <w:p>
+      <w:pPr>
+        <w:numPr>
+          <w:ilvl w:val="0"/>
+          <w:numId w:val="5"/>
+        </w:numPr>
+        <w:spacing w:after="0" w:afterAutospacing="0"/>
+        <w:ind w:left="720" w:hanging="360"/>
+        <w:rPr>
+          <w:rFonts w:ascii="Calibri" w:cs="Calibri" w:eastAsia="Calibri" w:hAnsi="Calibri"/>
+          <w:sz w:val="24"/>
+          <w:szCs w:val="24"/>
           <w:u w:val="none"/>
         </w:rPr>
       </w:pPr>
       <w:r>
         <w:rPr>
-          <w:rtl w:val="0"/>
-        </w:rPr>
-      </w:r>
-    </w:p>
-    <w:p>
-      <w:pPr>
-        <w:numPr>
-          <w:ilvl w:val="0"/>
-          <w:numId w:val="14"/>
-        </w:numPr>
-        <w:spacing w:after="0" w:afterAutospacing="0"/>
-        <w:ind w:left="720" w:hanging="360"/>
-        <w:rPr>
-          <w:rFonts w:ascii="Calibri" w:cs="Calibri" w:eastAsia="Calibri" w:hAnsi="Calibri"/>
-          <w:sz w:val="24"/>
-          <w:szCs w:val="24"/>
-        </w:rPr>
-      </w:pPr>
-      <w:r>
-        <w:rPr>
-          <w:rFonts w:ascii="Calibri" w:cs="Calibri" w:eastAsia="Calibri" w:hAnsi="Calibri"/>
-          <w:sz w:val="24"/>
-          <w:szCs w:val="24"/>
-          <w:rtl w:val="0"/>
-        </w:rPr>
-        <w:t xml:space="preserve">Single material product ID (primary key)</w:t>
-      </w:r>
-    </w:p>
-    <w:p>
-      <w:pPr>
-        <w:numPr>
-          <w:ilvl w:val="0"/>
-          <w:numId w:val="14"/>
-        </w:numPr>
-        <w:spacing w:after="0" w:lineRule="auto"/>
-        <w:ind w:left="720" w:hanging="360"/>
-        <w:rPr>
-          <w:rFonts w:ascii="Calibri" w:cs="Calibri" w:eastAsia="Calibri" w:hAnsi="Calibri"/>
-          <w:sz w:val="24"/>
-          <w:szCs w:val="24"/>
-        </w:rPr>
-      </w:pPr>
-      <w:r>
-        <w:rPr>
-          <w:rFonts w:ascii="Calibri" w:cs="Calibri" w:eastAsia="Calibri" w:hAnsi="Calibri"/>
-          <w:sz w:val="24"/>
-          <w:szCs w:val="24"/>
-          <w:rtl w:val="0"/>
-        </w:rPr>
-        <w:t xml:space="preserve">Manufacturer ID (foreign key references entity Manufacturer)</w:t>
-      </w:r>
-    </w:p>
-    <w:p>
-      <w:pPr>
-        <w:numPr>
-          <w:ilvl w:val="0"/>
-          <w:numId w:val="14"/>
-        </w:numPr>
-        <w:spacing w:after="0" w:lineRule="auto"/>
-        <w:ind w:left="720" w:hanging="360"/>
-        <w:rPr>
-          <w:rFonts w:ascii="Calibri" w:cs="Calibri" w:eastAsia="Calibri" w:hAnsi="Calibri"/>
-          <w:sz w:val="24"/>
-          <w:szCs w:val="24"/>
-          <w:u w:val="none"/>
-        </w:rPr>
-      </w:pPr>
-      <w:r>
-        <w:rPr>
-          <w:rFonts w:ascii="Calibri" w:cs="Calibri" w:eastAsia="Calibri" w:hAnsi="Calibri"/>
-          <w:sz w:val="24"/>
-          <w:szCs w:val="24"/>
-          <w:rtl w:val="0"/>
-        </w:rPr>
-        <w:t xml:space="preserve">Brand name - text</w:t>
-      </w:r>
-    </w:p>
-    <w:p>
-      <w:pPr>
-        <w:numPr>
-          <w:ilvl w:val="0"/>
-          <w:numId w:val="14"/>
-        </w:numPr>
-        <w:ind w:left="720" w:hanging="360"/>
-        <w:rPr>
-          <w:rFonts w:ascii="Calibri" w:cs="Calibri" w:eastAsia="Calibri" w:hAnsi="Calibri"/>
-          <w:sz w:val="24"/>
-          <w:szCs w:val="24"/>
-        </w:rPr>
-      </w:pPr>
-      <w:r>
-        <w:rPr>
-          <w:rFonts w:ascii="Calibri" w:cs="Calibri" w:eastAsia="Calibri" w:hAnsi="Calibri"/>
-          <w:sz w:val="24"/>
-          <w:szCs w:val="24"/>
-          <w:rtl w:val="0"/>
-        </w:rPr>
-        <w:t xml:space="preserve">Material type - text</w:t>
-      </w:r>
-    </w:p>
-    <w:p>
-      <w:pPr>
-        <w:rPr>
-          <w:rFonts w:ascii="Calibri" w:cs="Calibri" w:eastAsia="Calibri" w:hAnsi="Calibri"/>
-          <w:sz w:val="24"/>
-          <w:szCs w:val="24"/>
-        </w:rPr>
-      </w:pPr>
-      <w:r>
-        <w:rPr>
-          <w:rFonts w:ascii="Calibri" w:cs="Calibri" w:eastAsia="Calibri" w:hAnsi="Calibri"/>
-          <w:sz w:val="24"/>
-          <w:szCs w:val="24"/>
-          <w:rtl w:val="0"/>
-        </w:rPr>
-        <w:t xml:space="preserve">Entity Manufacturer:</w:t>
-      </w:r>
-    </w:p>
-    <w:p>
-      <w:pPr>
-        <w:numPr>
-          <w:ilvl w:val="0"/>
-          <w:numId w:val="8"/>
-        </w:numPr>
-        <w:spacing w:after="0" w:lineRule="auto"/>
-        <w:ind w:left="720" w:hanging="360"/>
-        <w:rPr>
-          <w:rFonts w:ascii="Calibri" w:cs="Calibri" w:eastAsia="Calibri" w:hAnsi="Calibri"/>
-          <w:sz w:val="24"/>
-          <w:szCs w:val="24"/>
-        </w:rPr>
-      </w:pPr>
-      <w:r>
-        <w:rPr>
-          <w:rFonts w:ascii="Calibri" w:cs="Calibri" w:eastAsia="Calibri" w:hAnsi="Calibri"/>
-          <w:sz w:val="24"/>
-          <w:szCs w:val="24"/>
-          <w:rtl w:val="0"/>
-        </w:rPr>
-        <w:t xml:space="preserve">Manufacturer ID (primary key)</w:t>
-      </w:r>
-    </w:p>
-    <w:p>
-      <w:pPr>
-        <w:numPr>
-          <w:ilvl w:val="0"/>
-          <w:numId w:val="8"/>
-        </w:numPr>
-        <w:ind w:left="720" w:hanging="360"/>
-        <w:rPr>
-          <w:rFonts w:ascii="Calibri" w:cs="Calibri" w:eastAsia="Calibri" w:hAnsi="Calibri"/>
-          <w:sz w:val="24"/>
-          <w:szCs w:val="24"/>
-        </w:rPr>
-      </w:pPr>
-      <w:r>
-        <w:rPr>
-          <w:rFonts w:ascii="Calibri" w:cs="Calibri" w:eastAsia="Calibri" w:hAnsi="Calibri"/>
-          <w:sz w:val="24"/>
-          <w:szCs w:val="24"/>
-          <w:rtl w:val="0"/>
-        </w:rPr>
-        <w:t xml:space="preserve">Company name - text</w:t>
-      </w:r>
-    </w:p>
-    <w:p>
-      <w:pPr>
-        <w:rPr>
-          <w:rFonts w:ascii="Calibri" w:cs="Calibri" w:eastAsia="Calibri" w:hAnsi="Calibri"/>
-          <w:sz w:val="24"/>
-          <w:szCs w:val="24"/>
-        </w:rPr>
-      </w:pPr>
-      <w:r>
-        <w:rPr>
-          <w:rFonts w:ascii="Calibri" w:cs="Calibri" w:eastAsia="Calibri" w:hAnsi="Calibri"/>
-          <w:sz w:val="24"/>
-          <w:szCs w:val="24"/>
-          <w:rtl w:val="0"/>
-        </w:rPr>
-        <w:t xml:space="preserve">Entity VehicleSchedule:</w:t>
-      </w:r>
-    </w:p>
-    <w:p>
-      <w:pPr>
-        <w:numPr>
-          <w:ilvl w:val="0"/>
-          <w:numId w:val="4"/>
-        </w:numPr>
-        <w:spacing w:after="0" w:afterAutospacing="0"/>
-        <w:ind w:left="720" w:hanging="360"/>
-        <w:rPr>
-          <w:rFonts w:ascii="Calibri" w:cs="Calibri" w:eastAsia="Calibri" w:hAnsi="Calibri"/>
-          <w:sz w:val="24"/>
-          <w:szCs w:val="24"/>
-        </w:rPr>
-      </w:pPr>
-      <w:r>
-        <w:rPr>
-          <w:rFonts w:ascii="Calibri" w:cs="Calibri" w:eastAsia="Calibri" w:hAnsi="Calibri"/>
-          <w:sz w:val="24"/>
-          <w:szCs w:val="24"/>
-          <w:rtl w:val="0"/>
-        </w:rPr>
-        <w:t xml:space="preserve">VehicleSchedule relates Vehicle (m:1)</w:t>
-      </w:r>
-    </w:p>
-    <w:p>
-      <w:pPr>
-        <w:numPr>
-          <w:ilvl w:val="0"/>
-          <w:numId w:val="4"/>
-        </w:numPr>
-        <w:spacing w:after="0" w:afterAutospacing="0"/>
-        <w:ind w:left="720" w:hanging="360"/>
-        <w:rPr>
-          <w:rFonts w:ascii="Calibri" w:cs="Calibri" w:eastAsia="Calibri" w:hAnsi="Calibri"/>
-          <w:sz w:val="24"/>
-          <w:szCs w:val="24"/>
-        </w:rPr>
-      </w:pPr>
-      <w:r>
-        <w:rPr>
-          <w:rFonts w:ascii="Calibri" w:cs="Calibri" w:eastAsia="Calibri" w:hAnsi="Calibri"/>
-          <w:sz w:val="24"/>
-          <w:szCs w:val="24"/>
-          <w:rtl w:val="0"/>
-        </w:rPr>
-        <w:t xml:space="preserve">VehicleSchedule relates Driver (m:1)</w:t>
-      </w:r>
-    </w:p>
-    <w:p>
-      <w:pPr>
-        <w:numPr>
-          <w:ilvl w:val="0"/>
-          <w:numId w:val="4"/>
-        </w:numPr>
-        <w:spacing w:after="0" w:afterAutospacing="0"/>
-        <w:ind w:left="720" w:hanging="360"/>
-        <w:rPr>
-          <w:rFonts w:ascii="Calibri" w:cs="Calibri" w:eastAsia="Calibri" w:hAnsi="Calibri"/>
-          <w:sz w:val="24"/>
-          <w:szCs w:val="24"/>
-        </w:rPr>
-      </w:pPr>
-      <w:r>
-        <w:rPr>
-          <w:rFonts w:ascii="Calibri" w:cs="Calibri" w:eastAsia="Calibri" w:hAnsi="Calibri"/>
-          <w:sz w:val="24"/>
-          <w:szCs w:val="24"/>
-          <w:rtl w:val="0"/>
-        </w:rPr>
-        <w:t xml:space="preserve">VehicleSchedule relates ConstructionSchedule (m:1)</w:t>
-      </w:r>
-    </w:p>
-    <w:p>
-      <w:pPr>
-        <w:numPr>
-          <w:ilvl w:val="0"/>
-          <w:numId w:val="4"/>
-        </w:numPr>
-        <w:spacing w:after="0" w:afterAutospacing="0"/>
-        <w:ind w:left="720" w:hanging="360"/>
-        <w:rPr>
-          <w:rFonts w:ascii="Calibri" w:cs="Calibri" w:eastAsia="Calibri" w:hAnsi="Calibri"/>
-          <w:sz w:val="24"/>
-          <w:szCs w:val="24"/>
-        </w:rPr>
-      </w:pPr>
-      <w:r>
-        <w:rPr>
-          <w:rtl w:val="0"/>
-        </w:rPr>
-      </w:r>
-    </w:p>
-    <w:p>
-      <w:pPr>
-        <w:numPr>
-          <w:ilvl w:val="0"/>
-          <w:numId w:val="8"/>
-        </w:numPr>
-        <w:spacing w:after="0" w:lineRule="auto"/>
-        <w:ind w:left="720" w:hanging="360"/>
-        <w:rPr>
-          <w:rFonts w:ascii="Calibri" w:cs="Calibri" w:eastAsia="Calibri" w:hAnsi="Calibri"/>
-          <w:sz w:val="24"/>
-          <w:szCs w:val="24"/>
-        </w:rPr>
-      </w:pPr>
-      <w:r>
-        <w:rPr>
-          <w:rFonts w:ascii="Calibri" w:cs="Calibri" w:eastAsia="Calibri" w:hAnsi="Calibri"/>
-          <w:sz w:val="24"/>
-          <w:szCs w:val="24"/>
-          <w:rtl w:val="0"/>
-        </w:rPr>
-        <w:t xml:space="preserve">Vehicle schedule ID (primary key)</w:t>
-      </w:r>
-    </w:p>
-    <w:p>
-      <w:pPr>
-        <w:numPr>
-          <w:ilvl w:val="0"/>
-          <w:numId w:val="8"/>
-        </w:numPr>
-        <w:spacing w:after="0" w:lineRule="auto"/>
-        <w:ind w:left="720" w:hanging="360"/>
-        <w:rPr>
-          <w:rFonts w:ascii="Calibri" w:cs="Calibri" w:eastAsia="Calibri" w:hAnsi="Calibri"/>
-          <w:sz w:val="24"/>
-          <w:szCs w:val="24"/>
-        </w:rPr>
-      </w:pPr>
-      <w:r>
-        <w:rPr>
-          <w:rFonts w:ascii="Calibri" w:cs="Calibri" w:eastAsia="Calibri" w:hAnsi="Calibri"/>
-          <w:sz w:val="24"/>
-          <w:szCs w:val="24"/>
-          <w:rtl w:val="0"/>
-        </w:rPr>
-        <w:t xml:space="preserve">Vehicle ID (foreign key references entity Vehicle)</w:t>
-      </w:r>
-    </w:p>
-    <w:p>
-      <w:pPr>
-        <w:numPr>
-          <w:ilvl w:val="0"/>
-          <w:numId w:val="8"/>
-        </w:numPr>
-        <w:spacing w:after="0" w:lineRule="auto"/>
-        <w:ind w:left="720" w:hanging="360"/>
-        <w:rPr>
-          <w:rFonts w:ascii="Calibri" w:cs="Calibri" w:eastAsia="Calibri" w:hAnsi="Calibri"/>
-          <w:sz w:val="24"/>
-          <w:szCs w:val="24"/>
-          <w:u w:val="none"/>
-        </w:rPr>
-      </w:pPr>
-      <w:r>
-        <w:rPr>
-          <w:rFonts w:ascii="Calibri" w:cs="Calibri" w:eastAsia="Calibri" w:hAnsi="Calibri"/>
-          <w:sz w:val="24"/>
-          <w:szCs w:val="24"/>
-          <w:rtl w:val="0"/>
-        </w:rPr>
-        <w:t xml:space="preserve">Driver ID (foreign key references entity Driver)</w:t>
-      </w:r>
-    </w:p>
-    <w:p>
-      <w:pPr>
-        <w:numPr>
-          <w:ilvl w:val="0"/>
-          <w:numId w:val="8"/>
-        </w:numPr>
-        <w:spacing w:after="0" w:lineRule="auto"/>
-        <w:ind w:left="720" w:hanging="360"/>
-        <w:rPr>
-          <w:rFonts w:ascii="Calibri" w:cs="Calibri" w:eastAsia="Calibri" w:hAnsi="Calibri"/>
-          <w:sz w:val="24"/>
-          <w:szCs w:val="24"/>
-          <w:u w:val="none"/>
-        </w:rPr>
-      </w:pPr>
-      <w:r>
-        <w:rPr>
-          <w:rFonts w:ascii="Calibri" w:cs="Calibri" w:eastAsia="Calibri" w:hAnsi="Calibri"/>
-          <w:sz w:val="24"/>
-          <w:szCs w:val="24"/>
-          <w:rtl w:val="0"/>
-        </w:rPr>
-        <w:t xml:space="preserve">ConstructionSchedule ID (foreign key references entity ConstructionSchedule)</w:t>
-      </w:r>
-    </w:p>
-    <w:p>
-      <w:pPr>
-        <w:numPr>
-          <w:ilvl w:val="0"/>
-          <w:numId w:val="8"/>
-        </w:numPr>
-        <w:spacing w:after="0" w:lineRule="auto"/>
-        <w:ind w:left="720" w:hanging="360"/>
-        <w:rPr>
-          <w:rFonts w:ascii="Calibri" w:cs="Calibri" w:eastAsia="Calibri" w:hAnsi="Calibri"/>
-          <w:sz w:val="24"/>
-          <w:szCs w:val="24"/>
-        </w:rPr>
-      </w:pPr>
-      <w:r>
-        <w:rPr>
-          <w:rFonts w:ascii="Calibri" w:cs="Calibri" w:eastAsia="Calibri" w:hAnsi="Calibri"/>
-          <w:sz w:val="24"/>
-          <w:szCs w:val="24"/>
-          <w:rtl w:val="0"/>
-        </w:rPr>
-        <w:t xml:space="preserve">Date of start - text</w:t>
-      </w:r>
-    </w:p>
-    <w:p>
-      <w:pPr>
-        <w:numPr>
-          <w:ilvl w:val="0"/>
-          <w:numId w:val="8"/>
-        </w:numPr>
-        <w:ind w:left="720" w:hanging="360"/>
-        <w:rPr>
-          <w:rFonts w:ascii="Calibri" w:cs="Calibri" w:eastAsia="Calibri" w:hAnsi="Calibri"/>
-          <w:sz w:val="24"/>
-          <w:szCs w:val="24"/>
-        </w:rPr>
-      </w:pPr>
-      <w:r>
-        <w:rPr>
-          <w:rFonts w:ascii="Calibri" w:cs="Calibri" w:eastAsia="Calibri" w:hAnsi="Calibri"/>
-          <w:sz w:val="24"/>
-          <w:szCs w:val="24"/>
-          <w:rtl w:val="0"/>
-        </w:rPr>
-        <w:t xml:space="preserve">Date of end - text</w:t>
-      </w:r>
-    </w:p>
-    <w:p>
-      <w:pPr>
-        <w:rPr>
-          <w:rFonts w:ascii="Calibri" w:cs="Calibri" w:eastAsia="Calibri" w:hAnsi="Calibri"/>
-          <w:sz w:val="24"/>
-          <w:szCs w:val="24"/>
-        </w:rPr>
-      </w:pPr>
-      <w:r>
-        <w:rPr>
-          <w:rFonts w:ascii="Calibri" w:cs="Calibri" w:eastAsia="Calibri" w:hAnsi="Calibri"/>
-          <w:sz w:val="24"/>
-          <w:szCs w:val="24"/>
-          <w:rtl w:val="0"/>
-        </w:rPr>
-        <w:t xml:space="preserve">Entity OfficeWorkspaceSchedule:</w:t>
-      </w:r>
-    </w:p>
-    <w:p>
-      <w:pPr>
-        <w:numPr>
-          <w:ilvl w:val="0"/>
-          <w:numId w:val="6"/>
-        </w:numPr>
-        <w:spacing w:after="0" w:afterAutospacing="0"/>
-        <w:ind w:left="720" w:hanging="360"/>
-        <w:rPr>
-          <w:rFonts w:ascii="Calibri" w:cs="Calibri" w:eastAsia="Calibri" w:hAnsi="Calibri"/>
-          <w:sz w:val="24"/>
-          <w:szCs w:val="24"/>
-        </w:rPr>
-      </w:pPr>
-      <w:r>
-        <w:rPr>
-          <w:rFonts w:ascii="Calibri" w:cs="Calibri" w:eastAsia="Calibri" w:hAnsi="Calibri"/>
-          <w:sz w:val="24"/>
-          <w:szCs w:val="24"/>
-          <w:rtl w:val="0"/>
-        </w:rPr>
-        <w:t xml:space="preserve">OfficeWorkspaceSchedule relates OfficeWorker (m:1)</w:t>
-      </w:r>
-    </w:p>
-    <w:p>
-      <w:pPr>
-        <w:numPr>
-          <w:ilvl w:val="0"/>
-          <w:numId w:val="6"/>
-        </w:numPr>
-        <w:spacing w:after="0" w:afterAutospacing="0"/>
-        <w:ind w:left="720" w:hanging="360"/>
-        <w:rPr>
-          <w:rFonts w:ascii="Calibri" w:cs="Calibri" w:eastAsia="Calibri" w:hAnsi="Calibri"/>
-          <w:sz w:val="24"/>
-          <w:szCs w:val="24"/>
-        </w:rPr>
-      </w:pPr>
-      <w:r>
-        <w:rPr>
-          <w:rFonts w:ascii="Calibri" w:cs="Calibri" w:eastAsia="Calibri" w:hAnsi="Calibri"/>
-          <w:sz w:val="24"/>
-          <w:szCs w:val="24"/>
-          <w:rtl w:val="0"/>
-        </w:rPr>
-        <w:t xml:space="preserve">OfficeWorkspaceSchedule relates OfficeWorkspaceChair (m:1)</w:t>
-      </w:r>
-    </w:p>
-    <w:p>
-      <w:pPr>
-        <w:numPr>
-          <w:ilvl w:val="0"/>
-          <w:numId w:val="6"/>
-        </w:numPr>
-        <w:spacing w:after="0" w:afterAutospacing="0"/>
-        <w:ind w:left="720" w:hanging="360"/>
-        <w:rPr>
-          <w:rFonts w:ascii="Calibri" w:cs="Calibri" w:eastAsia="Calibri" w:hAnsi="Calibri"/>
-          <w:sz w:val="24"/>
-          <w:szCs w:val="24"/>
-        </w:rPr>
-      </w:pPr>
-      <w:r>
-        <w:rPr>
-          <w:rtl w:val="0"/>
-        </w:rPr>
-      </w:r>
-    </w:p>
-    <w:p>
-      <w:pPr>
-        <w:numPr>
-          <w:ilvl w:val="0"/>
-          <w:numId w:val="6"/>
-        </w:numPr>
-        <w:spacing w:after="0" w:afterAutospacing="0"/>
-        <w:ind w:left="720" w:hanging="360"/>
-        <w:rPr>
-          <w:rFonts w:ascii="Calibri" w:cs="Calibri" w:eastAsia="Calibri" w:hAnsi="Calibri"/>
-          <w:sz w:val="24"/>
-          <w:szCs w:val="24"/>
-        </w:rPr>
-      </w:pPr>
-      <w:r>
-        <w:rPr>
-          <w:rFonts w:ascii="Calibri" w:cs="Calibri" w:eastAsia="Calibri" w:hAnsi="Calibri"/>
-          <w:sz w:val="24"/>
-          <w:szCs w:val="24"/>
-          <w:rtl w:val="0"/>
-        </w:rPr>
-        <w:t xml:space="preserve">Office workspace schedule ID (primary key)</w:t>
-      </w:r>
-    </w:p>
-    <w:p>
-      <w:pPr>
-        <w:numPr>
-          <w:ilvl w:val="0"/>
-          <w:numId w:val="6"/>
-        </w:numPr>
-        <w:spacing w:after="0" w:afterAutospacing="0"/>
-        <w:ind w:left="720" w:hanging="360"/>
-        <w:rPr>
-          <w:rFonts w:ascii="Calibri" w:cs="Calibri" w:eastAsia="Calibri" w:hAnsi="Calibri"/>
-          <w:sz w:val="24"/>
-          <w:szCs w:val="24"/>
-        </w:rPr>
-      </w:pPr>
-      <w:r>
-        <w:rPr>
-          <w:rFonts w:ascii="Calibri" w:cs="Calibri" w:eastAsia="Calibri" w:hAnsi="Calibri"/>
-          <w:sz w:val="24"/>
-          <w:szCs w:val="24"/>
-          <w:rtl w:val="0"/>
-        </w:rPr>
-        <w:t xml:space="preserve">Office worker ID (foreign key references entity OfficeWorker)</w:t>
-      </w:r>
-    </w:p>
-    <w:p>
-      <w:pPr>
-        <w:numPr>
-          <w:ilvl w:val="0"/>
-          <w:numId w:val="6"/>
-        </w:numPr>
-        <w:spacing w:after="0" w:afterAutospacing="0"/>
-        <w:ind w:left="720" w:hanging="360"/>
-        <w:rPr>
-          <w:rFonts w:ascii="Calibri" w:cs="Calibri" w:eastAsia="Calibri" w:hAnsi="Calibri"/>
-          <w:sz w:val="24"/>
-          <w:szCs w:val="24"/>
-        </w:rPr>
-      </w:pPr>
-      <w:r>
-        <w:rPr>
-          <w:rFonts w:ascii="Calibri" w:cs="Calibri" w:eastAsia="Calibri" w:hAnsi="Calibri"/>
-          <w:sz w:val="24"/>
-          <w:szCs w:val="24"/>
-          <w:rtl w:val="0"/>
-        </w:rPr>
-        <w:t xml:space="preserve">Office workspace chair ID (foreign key references entity OfficeWorkspaceChair)</w:t>
-      </w:r>
-    </w:p>
-    <w:p>
-      <w:pPr>
-        <w:numPr>
-          <w:ilvl w:val="0"/>
-          <w:numId w:val="6"/>
-        </w:numPr>
-        <w:ind w:left="720" w:hanging="360"/>
-        <w:rPr>
-          <w:rFonts w:ascii="Calibri" w:cs="Calibri" w:eastAsia="Calibri" w:hAnsi="Calibri"/>
-          <w:sz w:val="24"/>
-          <w:szCs w:val="24"/>
-        </w:rPr>
-      </w:pPr>
-      <w:r>
-        <w:rPr>
-          <w:rFonts w:ascii="Calibri" w:cs="Calibri" w:eastAsia="Calibri" w:hAnsi="Calibri"/>
-          <w:sz w:val="24"/>
-          <w:szCs w:val="24"/>
-          <w:rtl w:val="0"/>
-        </w:rPr>
-        <w:t xml:space="preserve">Duration - integer</w:t>
-      </w:r>
-    </w:p>
-    <w:p>
-      <w:pPr>
-        <w:rPr>
-          <w:rFonts w:ascii="Calibri" w:cs="Calibri" w:eastAsia="Calibri" w:hAnsi="Calibri"/>
-          <w:sz w:val="24"/>
-          <w:szCs w:val="24"/>
-        </w:rPr>
-      </w:pPr>
-      <w:r>
-        <w:rPr>
-          <w:rFonts w:ascii="Calibri" w:cs="Calibri" w:eastAsia="Calibri" w:hAnsi="Calibri"/>
-          <w:sz w:val="24"/>
-          <w:szCs w:val="24"/>
-          <w:rtl w:val="0"/>
-        </w:rPr>
-        <w:t xml:space="preserve">Entity ConstructionSchedule:</w:t>
-      </w:r>
-    </w:p>
-    <w:p>
-      <w:pPr>
-        <w:numPr>
-          <w:ilvl w:val="0"/>
-          <w:numId w:val="1"/>
-        </w:numPr>
-        <w:spacing w:after="0" w:afterAutospacing="0"/>
-        <w:ind w:left="720" w:hanging="360"/>
-        <w:rPr>
-          <w:rFonts w:ascii="Calibri" w:cs="Calibri" w:eastAsia="Calibri" w:hAnsi="Calibri"/>
-          <w:sz w:val="24"/>
-          <w:szCs w:val="24"/>
-        </w:rPr>
-      </w:pPr>
-      <w:r>
-        <w:rPr>
-          <w:rFonts w:ascii="Calibri" w:cs="Calibri" w:eastAsia="Calibri" w:hAnsi="Calibri"/>
-          <w:sz w:val="24"/>
-          <w:szCs w:val="24"/>
-          <w:rtl w:val="0"/>
-        </w:rPr>
-        <w:t xml:space="preserve">ConstructionSchedule relates ConstructionWorker (m:n)</w:t>
-      </w:r>
-    </w:p>
-    <w:p>
-      <w:pPr>
-        <w:numPr>
-          <w:ilvl w:val="0"/>
-          <w:numId w:val="1"/>
-        </w:numPr>
-        <w:spacing w:after="0" w:afterAutospacing="0"/>
-        <w:ind w:left="720" w:hanging="360"/>
-        <w:rPr>
-          <w:rFonts w:ascii="Calibri" w:cs="Calibri" w:eastAsia="Calibri" w:hAnsi="Calibri"/>
-          <w:sz w:val="24"/>
-          <w:szCs w:val="24"/>
-        </w:rPr>
-      </w:pPr>
-      <w:r>
-        <w:rPr>
-          <w:rFonts w:ascii="Calibri" w:cs="Calibri" w:eastAsia="Calibri" w:hAnsi="Calibri"/>
-          <w:sz w:val="24"/>
-          <w:szCs w:val="24"/>
-          <w:rtl w:val="0"/>
-        </w:rPr>
-        <w:t xml:space="preserve">ConstructionSchedule relates ConstructionLocation (1:n) // because it can be that one location has multiple schedules over time</w:t>
-      </w:r>
-    </w:p>
-    <w:p>
-      <w:pPr>
-        <w:numPr>
-          <w:ilvl w:val="0"/>
-          <w:numId w:val="1"/>
-        </w:numPr>
-        <w:spacing w:after="0" w:afterAutospacing="0"/>
-        <w:ind w:left="720" w:hanging="360"/>
-        <w:rPr>
-          <w:rFonts w:ascii="Calibri" w:cs="Calibri" w:eastAsia="Calibri" w:hAnsi="Calibri"/>
-          <w:sz w:val="24"/>
-          <w:szCs w:val="24"/>
-        </w:rPr>
-      </w:pPr>
-      <w:r>
-        <w:rPr>
-          <w:rtl w:val="0"/>
-        </w:rPr>
-      </w:r>
-    </w:p>
-    <w:p>
-      <w:pPr>
-        <w:numPr>
-          <w:ilvl w:val="0"/>
-          <w:numId w:val="1"/>
-        </w:numPr>
-        <w:spacing w:after="0" w:afterAutospacing="0"/>
-        <w:ind w:left="720" w:hanging="360"/>
-        <w:rPr>
-          <w:rFonts w:ascii="Calibri" w:cs="Calibri" w:eastAsia="Calibri" w:hAnsi="Calibri"/>
-          <w:sz w:val="24"/>
-          <w:szCs w:val="24"/>
-        </w:rPr>
-      </w:pPr>
-      <w:r>
-        <w:rPr>
-          <w:rFonts w:ascii="Calibri" w:cs="Calibri" w:eastAsia="Calibri" w:hAnsi="Calibri"/>
-          <w:sz w:val="24"/>
-          <w:szCs w:val="24"/>
-          <w:rtl w:val="0"/>
-        </w:rPr>
-        <w:t xml:space="preserve">Construction schedule ID (primary key)</w:t>
-      </w:r>
-    </w:p>
-    <w:p>
-      <w:pPr>
-        <w:numPr>
-          <w:ilvl w:val="0"/>
-          <w:numId w:val="1"/>
-        </w:numPr>
-        <w:spacing w:after="0" w:afterAutospacing="0"/>
-        <w:ind w:left="720" w:hanging="360"/>
-        <w:rPr>
-          <w:rFonts w:ascii="Calibri" w:cs="Calibri" w:eastAsia="Calibri" w:hAnsi="Calibri"/>
-          <w:sz w:val="24"/>
-          <w:szCs w:val="24"/>
-        </w:rPr>
-      </w:pPr>
-      <w:r>
-        <w:rPr>
-          <w:rFonts w:ascii="Calibri" w:cs="Calibri" w:eastAsia="Calibri" w:hAnsi="Calibri"/>
-          <w:sz w:val="24"/>
-          <w:szCs w:val="24"/>
-          <w:rtl w:val="0"/>
-        </w:rPr>
-        <w:t xml:space="preserve">Construction worker ID (foreign key references entity ConstructionWorker)</w:t>
-      </w:r>
-    </w:p>
-    <w:p>
-      <w:pPr>
-        <w:numPr>
-          <w:ilvl w:val="0"/>
-          <w:numId w:val="1"/>
-        </w:numPr>
-        <w:spacing w:after="0" w:afterAutospacing="0"/>
-        <w:ind w:left="720" w:hanging="360"/>
-        <w:rPr>
-          <w:rFonts w:ascii="Calibri" w:cs="Calibri" w:eastAsia="Calibri" w:hAnsi="Calibri"/>
-          <w:sz w:val="24"/>
-          <w:szCs w:val="24"/>
-        </w:rPr>
-      </w:pPr>
-      <w:r>
-        <w:rPr>
-          <w:rFonts w:ascii="Calibri" w:cs="Calibri" w:eastAsia="Calibri" w:hAnsi="Calibri"/>
-          <w:sz w:val="24"/>
-          <w:szCs w:val="24"/>
-          <w:rtl w:val="0"/>
-        </w:rPr>
-        <w:t xml:space="preserve">Construction location ID (foreign key references entity ConstructionLocation)</w:t>
-      </w:r>
-    </w:p>
-    <w:p>
-      <w:pPr>
-        <w:numPr>
-          <w:ilvl w:val="0"/>
-          <w:numId w:val="1"/>
-        </w:numPr>
-        <w:spacing w:after="0" w:afterAutospacing="0"/>
-        <w:ind w:left="720" w:hanging="360"/>
-        <w:rPr>
-          <w:rFonts w:ascii="Calibri" w:cs="Calibri" w:eastAsia="Calibri" w:hAnsi="Calibri"/>
-          <w:sz w:val="24"/>
-          <w:szCs w:val="24"/>
-          <w:u w:val="none"/>
-        </w:rPr>
-      </w:pPr>
-      <w:r>
-        <w:rPr>
-          <w:rFonts w:ascii="Calibri" w:cs="Calibri" w:eastAsia="Calibri" w:hAnsi="Calibri"/>
-          <w:sz w:val="24"/>
-          <w:szCs w:val="24"/>
-          <w:rtl w:val="0"/>
-        </w:rPr>
-        <w:t xml:space="preserve">Order ID (foreign key references entity Order)</w:t>
-      </w:r>
-    </w:p>
-    <w:p>
-      <w:pPr>
-        <w:numPr>
-          <w:ilvl w:val="0"/>
-          <w:numId w:val="1"/>
-        </w:numPr>
-        <w:ind w:left="720" w:hanging="360"/>
-        <w:rPr>
-          <w:rFonts w:ascii="Calibri" w:cs="Calibri" w:eastAsia="Calibri" w:hAnsi="Calibri"/>
-          <w:sz w:val="24"/>
-          <w:szCs w:val="24"/>
-          <w:u w:val="none"/>
-        </w:rPr>
-      </w:pPr>
-      <w:r>
-        <w:rPr>
-          <w:rFonts w:ascii="Calibri" w:cs="Calibri" w:eastAsia="Calibri" w:hAnsi="Calibri"/>
-          <w:sz w:val="24"/>
-          <w:szCs w:val="24"/>
-          <w:rtl w:val="0"/>
-        </w:rPr>
-        <w:t xml:space="preserve">Duration - integer</w:t>
-      </w:r>
-    </w:p>
-    <w:p>
-      <w:pPr>
-        <w:rPr>
-          <w:rFonts w:ascii="Calibri" w:cs="Calibri" w:eastAsia="Calibri" w:hAnsi="Calibri"/>
-          <w:sz w:val="24"/>
-          <w:szCs w:val="24"/>
-        </w:rPr>
-      </w:pPr>
-      <w:r>
-        <w:rPr>
-          <w:rFonts w:ascii="Calibri" w:cs="Calibri" w:eastAsia="Calibri" w:hAnsi="Calibri"/>
-          <w:sz w:val="24"/>
-          <w:szCs w:val="24"/>
-          <w:rtl w:val="0"/>
-        </w:rPr>
-        <w:t xml:space="preserve">Entity Employee:</w:t>
-      </w:r>
-    </w:p>
-    <w:p>
-      <w:pPr>
-        <w:numPr>
-          <w:ilvl w:val="0"/>
-          <w:numId w:val="8"/>
-        </w:numPr>
-        <w:spacing w:after="0" w:lineRule="auto"/>
-        <w:ind w:left="720" w:hanging="360"/>
-        <w:rPr>
-          <w:rFonts w:ascii="Calibri" w:cs="Calibri" w:eastAsia="Calibri" w:hAnsi="Calibri"/>
-          <w:sz w:val="24"/>
-          <w:szCs w:val="24"/>
-        </w:rPr>
-      </w:pPr>
-      <w:r>
-        <w:rPr>
-          <w:rFonts w:ascii="Calibri" w:cs="Calibri" w:eastAsia="Calibri" w:hAnsi="Calibri"/>
-          <w:sz w:val="24"/>
-          <w:szCs w:val="24"/>
-          <w:rtl w:val="0"/>
-        </w:rPr>
-        <w:t xml:space="preserve">Employee ID (primary key)</w:t>
-      </w:r>
-    </w:p>
-    <w:p>
-      <w:pPr>
-        <w:numPr>
-          <w:ilvl w:val="0"/>
-          <w:numId w:val="8"/>
-        </w:numPr>
-        <w:spacing w:after="0" w:lineRule="auto"/>
-        <w:ind w:left="720" w:hanging="360"/>
-        <w:rPr>
-          <w:rFonts w:ascii="Calibri" w:cs="Calibri" w:eastAsia="Calibri" w:hAnsi="Calibri"/>
-          <w:sz w:val="24"/>
-          <w:szCs w:val="24"/>
-        </w:rPr>
-      </w:pPr>
-      <w:r>
-        <w:rPr>
-          <w:rFonts w:ascii="Calibri" w:cs="Calibri" w:eastAsia="Calibri" w:hAnsi="Calibri"/>
-          <w:sz w:val="24"/>
-          <w:szCs w:val="24"/>
-          <w:rtl w:val="0"/>
-        </w:rPr>
-        <w:t xml:space="preserve">Name</w:t>
-      </w:r>
-    </w:p>
-    <w:p>
-      <w:pPr>
-        <w:numPr>
-          <w:ilvl w:val="0"/>
-          <w:numId w:val="8"/>
-        </w:numPr>
-        <w:spacing w:after="0" w:lineRule="auto"/>
-        <w:ind w:left="720" w:hanging="360"/>
-        <w:rPr>
-          <w:rFonts w:ascii="Calibri" w:cs="Calibri" w:eastAsia="Calibri" w:hAnsi="Calibri"/>
-          <w:sz w:val="24"/>
-          <w:szCs w:val="24"/>
-        </w:rPr>
-      </w:pPr>
-      <w:r>
-        <w:rPr>
-          <w:rFonts w:ascii="Calibri" w:cs="Calibri" w:eastAsia="Calibri" w:hAnsi="Calibri"/>
-          <w:sz w:val="24"/>
-          <w:szCs w:val="24"/>
-          <w:rtl w:val="0"/>
-        </w:rPr>
-        <w:t xml:space="preserve">Age</w:t>
-      </w:r>
-    </w:p>
-    <w:p>
-      <w:pPr>
-        <w:numPr>
-          <w:ilvl w:val="0"/>
-          <w:numId w:val="2"/>
-        </w:numPr>
-        <w:spacing w:after="0" w:afterAutospacing="0"/>
-        <w:ind w:left="720" w:hanging="360"/>
-        <w:rPr>
-          <w:rFonts w:ascii="Calibri" w:cs="Calibri" w:eastAsia="Calibri" w:hAnsi="Calibri"/>
-          <w:sz w:val="24"/>
-          <w:szCs w:val="24"/>
-        </w:rPr>
-      </w:pPr>
-      <w:r>
-        <w:rPr>
-          <w:rFonts w:ascii="Calibri" w:cs="Calibri" w:eastAsia="Calibri" w:hAnsi="Calibri"/>
-          <w:sz w:val="24"/>
-          <w:szCs w:val="24"/>
-          <w:rtl w:val="0"/>
-        </w:rPr>
-        <w:t xml:space="preserve">Gender</w:t>
-      </w:r>
-    </w:p>
-    <w:p>
-      <w:pPr>
-        <w:numPr>
-          <w:ilvl w:val="0"/>
-          <w:numId w:val="3"/>
-        </w:numPr>
-        <w:ind w:left="720" w:hanging="360"/>
-        <w:rPr>
-          <w:rFonts w:ascii="Calibri" w:cs="Calibri" w:eastAsia="Calibri" w:hAnsi="Calibri"/>
-          <w:sz w:val="24"/>
-          <w:szCs w:val="24"/>
-        </w:rPr>
-      </w:pPr>
-      <w:r>
-        <w:rPr>
-          <w:rFonts w:ascii="Calibri" w:cs="Calibri" w:eastAsia="Calibri" w:hAnsi="Calibri"/>
-          <w:sz w:val="24"/>
-          <w:szCs w:val="24"/>
-          <w:rtl w:val="0"/>
-        </w:rPr>
-        <w:t xml:space="preserve">Date of starting job</w:t>
-      </w:r>
-    </w:p>
-    <w:p>
-      <w:pPr>
-        <w:rPr>
-          <w:rFonts w:ascii="Calibri" w:cs="Calibri" w:eastAsia="Calibri" w:hAnsi="Calibri"/>
-          <w:sz w:val="24"/>
-          <w:szCs w:val="24"/>
-        </w:rPr>
-      </w:pPr>
-      <w:r>
-        <w:rPr>
-          <w:rFonts w:ascii="Calibri" w:cs="Calibri" w:eastAsia="Calibri" w:hAnsi="Calibri"/>
-          <w:sz w:val="24"/>
-          <w:szCs w:val="24"/>
-          <w:rtl w:val="0"/>
-        </w:rPr>
-        <w:t xml:space="preserve">Entity Driver:</w:t>
-      </w:r>
-    </w:p>
-    <w:p>
-      <w:pPr>
-        <w:numPr>
-          <w:ilvl w:val="0"/>
-          <w:numId w:val="5"/>
-        </w:numPr>
-        <w:spacing w:after="0" w:afterAutospacing="0"/>
-        <w:ind w:left="720" w:hanging="360"/>
-        <w:rPr>
-          <w:rFonts w:ascii="Calibri" w:cs="Calibri" w:eastAsia="Calibri" w:hAnsi="Calibri"/>
-          <w:sz w:val="24"/>
-          <w:szCs w:val="24"/>
-        </w:rPr>
-      </w:pPr>
-      <w:r>
-        <w:rPr>
-          <w:rFonts w:ascii="Calibri" w:cs="Calibri" w:eastAsia="Calibri" w:hAnsi="Calibri"/>
-          <w:sz w:val="24"/>
-          <w:szCs w:val="24"/>
-          <w:rtl w:val="0"/>
-        </w:rPr>
-        <w:t xml:space="preserve">Inherits Employee attributes</w:t>
-      </w:r>
-    </w:p>
-    <w:p>
-      <w:pPr>
-        <w:numPr>
-          <w:ilvl w:val="0"/>
-          <w:numId w:val="5"/>
-        </w:numPr>
-        <w:ind w:left="720" w:hanging="360"/>
-        <w:rPr>
-          <w:rFonts w:ascii="Calibri" w:cs="Calibri" w:eastAsia="Calibri" w:hAnsi="Calibri"/>
-          <w:sz w:val="24"/>
-          <w:szCs w:val="24"/>
-        </w:rPr>
-      </w:pPr>
-      <w:r>
-        <w:rPr>
-          <w:rFonts w:ascii="Calibri" w:cs="Calibri" w:eastAsia="Calibri" w:hAnsi="Calibri"/>
-          <w:sz w:val="24"/>
-          <w:szCs w:val="24"/>
-          <w:rtl w:val="0"/>
-        </w:rPr>
-        <w:t xml:space="preserve">Driver ID (primary key)</w:t>
-      </w:r>
-    </w:p>
-    <w:p>
-      <w:pPr>
-        <w:rPr>
-          <w:rFonts w:ascii="Calibri" w:cs="Calibri" w:eastAsia="Calibri" w:hAnsi="Calibri"/>
-          <w:sz w:val="24"/>
-          <w:szCs w:val="24"/>
-        </w:rPr>
-      </w:pPr>
-      <w:r>
-        <w:rPr>
-          <w:rFonts w:ascii="Calibri" w:cs="Calibri" w:eastAsia="Calibri" w:hAnsi="Calibri"/>
-          <w:sz w:val="24"/>
-          <w:szCs w:val="24"/>
-          <w:rtl w:val="0"/>
-        </w:rPr>
-        <w:t xml:space="preserve">Entity OfficeWorker:</w:t>
-      </w:r>
-    </w:p>
-    <w:p>
-      <w:pPr>
-        <w:numPr>
-          <w:ilvl w:val="0"/>
-          <w:numId w:val="11"/>
-        </w:numPr>
-        <w:spacing w:after="0" w:afterAutospacing="0"/>
-        <w:ind w:left="720" w:hanging="360"/>
-        <w:rPr>
-          <w:rFonts w:ascii="Calibri" w:cs="Calibri" w:eastAsia="Calibri" w:hAnsi="Calibri"/>
-          <w:sz w:val="24"/>
-          <w:szCs w:val="24"/>
-        </w:rPr>
-      </w:pPr>
-      <w:r>
-        <w:rPr>
-          <w:rFonts w:ascii="Calibri" w:cs="Calibri" w:eastAsia="Calibri" w:hAnsi="Calibri"/>
-          <w:sz w:val="24"/>
-          <w:szCs w:val="24"/>
-          <w:rtl w:val="0"/>
-        </w:rPr>
-        <w:t xml:space="preserve">Inherits Employee attributes</w:t>
-      </w:r>
-    </w:p>
-    <w:p>
-      <w:pPr>
-        <w:numPr>
-          <w:ilvl w:val="0"/>
-          <w:numId w:val="7"/>
-        </w:numPr>
-        <w:ind w:left="720" w:hanging="360"/>
-        <w:rPr>
-          <w:rFonts w:ascii="Calibri" w:cs="Calibri" w:eastAsia="Calibri" w:hAnsi="Calibri"/>
-          <w:sz w:val="24"/>
-          <w:szCs w:val="24"/>
-        </w:rPr>
-      </w:pPr>
-      <w:r>
-        <w:rPr>
-          <w:rFonts w:ascii="Calibri" w:cs="Calibri" w:eastAsia="Calibri" w:hAnsi="Calibri"/>
-          <w:sz w:val="24"/>
-          <w:szCs w:val="24"/>
-          <w:rtl w:val="0"/>
-        </w:rPr>
-        <w:t xml:space="preserve">Office worker ID (primary key)</w:t>
-      </w:r>
-    </w:p>
-    <w:p>
-      <w:pPr>
-        <w:rPr>
-          <w:rFonts w:ascii="Calibri" w:cs="Calibri" w:eastAsia="Calibri" w:hAnsi="Calibri"/>
-          <w:sz w:val="24"/>
-          <w:szCs w:val="24"/>
-        </w:rPr>
-      </w:pPr>
-      <w:r>
-        <w:rPr>
-          <w:rFonts w:ascii="Calibri" w:cs="Calibri" w:eastAsia="Calibri" w:hAnsi="Calibri"/>
-          <w:sz w:val="24"/>
-          <w:szCs w:val="24"/>
-          <w:rtl w:val="0"/>
-        </w:rPr>
-        <w:t xml:space="preserve">Entity ConstructionWorker:</w:t>
-      </w:r>
-    </w:p>
-    <w:p>
-      <w:pPr>
-        <w:numPr>
-          <w:ilvl w:val="0"/>
-          <w:numId w:val="5"/>
-        </w:numPr>
-        <w:spacing w:after="0" w:afterAutospacing="0"/>
-        <w:ind w:left="720" w:hanging="360"/>
-        <w:rPr>
-          <w:rFonts w:ascii="Calibri" w:cs="Calibri" w:eastAsia="Calibri" w:hAnsi="Calibri"/>
-          <w:sz w:val="24"/>
-          <w:szCs w:val="24"/>
-        </w:rPr>
-      </w:pPr>
-      <w:r>
-        <w:rPr>
-          <w:rFonts w:ascii="Calibri" w:cs="Calibri" w:eastAsia="Calibri" w:hAnsi="Calibri"/>
-          <w:sz w:val="24"/>
-          <w:szCs w:val="24"/>
-          <w:rtl w:val="0"/>
-        </w:rPr>
-        <w:t xml:space="preserve">Inherits Employee attributes</w:t>
+          <w:rFonts w:ascii="Calibri" w:cs="Calibri" w:eastAsia="Calibri" w:hAnsi="Calibri"/>
+          <w:sz w:val="24"/>
+          <w:szCs w:val="24"/>
+          <w:rtl w:val="0"/>
+        </w:rPr>
+        <w:t xml:space="preserve">Tools kit</w:t>
       </w:r>
     </w:p>
     <w:p>
@@ -2264,6 +2341,51 @@
           <w:szCs w:val="24"/>
         </w:rPr>
       </w:pPr>
+      <w:r>
+        <w:rPr>
+          <w:rtl w:val="0"/>
+        </w:rPr>
+      </w:r>
+    </w:p>
+    <w:p>
+      <w:pPr>
+        <w:rPr>
+          <w:rFonts w:ascii="Calibri" w:cs="Calibri" w:eastAsia="Calibri" w:hAnsi="Calibri"/>
+          <w:b w:val="1"/>
+          <w:bCs w:val="1"/>
+          <w:sz w:val="40"/>
+          <w:szCs w:val="40"/>
+        </w:rPr>
+      </w:pPr>
+      <w:r>
+        <w:rPr>
+          <w:rFonts w:ascii="Calibri" w:cs="Calibri" w:eastAsia="Calibri" w:hAnsi="Calibri"/>
+          <w:b w:val="1"/>
+          <w:bCs w:val="1"/>
+          <w:sz w:val="40"/>
+          <w:szCs w:val="40"/>
+          <w:rtl w:val="0"/>
+        </w:rPr>
+        <w:t xml:space="preserve">Transform.docx</w:t>
+      </w:r>
+    </w:p>
+    <w:p>
+      <w:pPr>
+        <w:rPr>
+          <w:rFonts w:ascii="Calibri" w:cs="Calibri" w:eastAsia="Calibri" w:hAnsi="Calibri"/>
+          <w:sz w:val="24"/>
+          <w:szCs w:val="24"/>
+        </w:rPr>
+      </w:pPr>
+      <w:r>
+        <w:rPr>
+          <w:rFonts w:ascii="Calibri" w:cs="Calibri" w:eastAsia="Calibri" w:hAnsi="Calibri"/>
+          <w:sz w:val="24"/>
+          <w:szCs w:val="24"/>
+          <w:rtl w:val="0"/>
+        </w:rPr>
+        <w:t xml:space="preserve">Text</w:t>
+      </w:r>
       <w:r>
         <w:rPr>
           <w:rtl w:val="0"/>

</xml_diff>